<commit_message>
Tờ trình Hoàng Minh: bỏ bảng so sánh R5, nêu kết quả đàm phán và điều khoản chốt
Co-Authored-By: Claude Opus 5.5 <noreply@anthropic.com>
Claude-Session: https://claude.ai/code/session_01HaB2daYpxGuc1PNCjeRWP1
</commit_message>
<xml_diff>
--- a/4. TỜ TRÌNH/Tờ trình 09102026-01 - Kết quả đàm phán Hoàng Minh 08.10 - NOXH Yên Sở.docx
+++ b/4. TỜ TRÌNH/Tờ trình 09102026-01 - Kết quả đàm phán Hoàng Minh 08.10 - NOXH Yên Sở.docx
@@ -858,7 +858,7 @@
           <w:color w:val="000000" w:themeColor="text1"/>
           <w:lang w:val="en-US"/>
         </w:rPr>
-        <w:t xml:space="preserve">Tạm ứng phí đổ thải (mới):</w:t>
+        <w:t xml:space="preserve">Phí đổ thải:</w:t>
       </w:r>
       <w:r>
         <w:rPr>
@@ -866,7 +866,7 @@
           <w:color w:val="000000" w:themeColor="text1"/>
           <w:lang w:val="en-US"/>
         </w:rPr>
-        <w:t xml:space="preserve"> khi khối lượng đổ thải được VNCN E&amp;C, Hoàng Minh và bãi đổ cùng xác nhận, VNCN E&amp;C tạm ứng bằng khối lượng xác nhận × 25.000 đồng/m³ (đơn giá phí đổ thải trong đơn giá hợp đồng), chuyển thẳng cho bãi đổ theo đề nghị bằng văn bản của Hoàng Minh và khấu trừ toàn bộ vào kỳ thanh toán gần nhất. Lý do: bãi đổ yêu cầu trả trước, Hoàng Minh không đủ tài chính ứng trước.</w:t>
+        <w:t xml:space="preserve"> bãi đổ yêu cầu thanh toán trước khi tiếp nhận, Hoàng Minh không đủ tài chính ứng trước; hai bên thống nhất VNCN E&amp;C tạm ứng phí đổ thải theo khối lượng thực đổ (mục 2).</w:t>
       </w:r>
     </w:p>
     <w:p>
@@ -892,1944 +892,230 @@
           <w:color w:val="000000" w:themeColor="text1"/>
           <w:lang w:val="en-US"/>
         </w:rPr>
-        <w:t xml:space="preserve">Thay đổi so với Tờ trình R5</w:t>
+        <w:t xml:space="preserve">Các điều khoản chốt với Hoàng Minh</w:t>
       </w:r>
     </w:p>
-    <w:tbl>
-      <w:tblPr>
-        <w:tblW w:w="5281" w:type="pct"/>
-        <w:tblLook w:val="04A0" w:firstRow="1" w:lastRow="0" w:firstColumn="1" w:lastColumn="0" w:noHBand="0" w:noVBand="1"/>
-      </w:tblPr>
-      <w:tblGrid>
-        <w:gridCol w:w="700"/>
-        <w:gridCol w:w="2000"/>
-        <w:gridCol w:w="3300"/>
-        <w:gridCol w:w="4169"/>
-      </w:tblGrid>
-      <w:tr>
-        <w:trPr>
-          <w:trHeight w:val="630"/>
-        </w:trPr>
-        <w:tc>
-          <w:tcPr>
-            <w:tcW w:w="700" w:type="dxa"/>
-            <w:tcBorders>
-              <w:top w:val="single" w:sz="4" w:space="0" w:color="auto"/>
-              <w:left w:val="nil"/>
-              <w:bottom w:val="single" w:sz="4" w:space="0" w:color="auto"/>
-              <w:right w:val="single" w:sz="4" w:space="0" w:color="auto"/>
-            </w:tcBorders>
-            <w:noWrap/>
-            <w:vAlign w:val="center"/>
-            <w:hideMark/>
-          </w:tcPr>
-          <w:p>
-            <w:pPr>
-              <w:spacing w:before="0" w:after="0" w:line="240" w:lineRule="auto"/>
-              <w:ind w:left="0"/>
-              <w:jc w:val="center"/>
-              <w:rPr>
-                <w:rFonts w:asciiTheme="majorHAnsi" w:eastAsia="Times New Roman" w:hAnsiTheme="majorHAnsi" w:cstheme="majorHAnsi"/>
-                <w:b/>
-                <w:bCs/>
-                <w:color w:val="000000" w:themeColor="text1"/>
-                <w:sz w:val="22"/>
-                <w:szCs w:val="22"/>
-              </w:rPr>
-            </w:pPr>
-            <w:r>
-              <w:rPr>
-                <w:b/>
-                <w:rFonts w:asciiTheme="majorHAnsi" w:eastAsia="Times New Roman" w:hAnsiTheme="majorHAnsi" w:cstheme="majorHAnsi"/>
-                <w:color w:val="000000" w:themeColor="text1"/>
-                <w:sz w:val="22"/>
-                <w:szCs w:val="22"/>
-              </w:rPr>
-              <w:t xml:space="preserve">STT</w:t>
-            </w:r>
-          </w:p>
-        </w:tc>
-        <w:tc>
-          <w:tcPr>
-            <w:tcW w:w="2000" w:type="dxa"/>
-            <w:tcBorders>
-              <w:top w:val="single" w:sz="4" w:space="0" w:color="auto"/>
-              <w:left w:val="nil"/>
-              <w:bottom w:val="single" w:sz="4" w:space="0" w:color="auto"/>
-              <w:right w:val="single" w:sz="4" w:space="0" w:color="auto"/>
-            </w:tcBorders>
-            <w:noWrap/>
-            <w:vAlign w:val="center"/>
-            <w:hideMark/>
-          </w:tcPr>
-          <w:p>
-            <w:pPr>
-              <w:spacing w:before="0" w:after="0" w:line="240" w:lineRule="auto"/>
-              <w:ind w:left="0"/>
-              <w:jc w:val="center"/>
-              <w:rPr>
-                <w:rFonts w:asciiTheme="majorHAnsi" w:eastAsia="Times New Roman" w:hAnsiTheme="majorHAnsi" w:cstheme="majorHAnsi"/>
-                <w:b/>
-                <w:bCs/>
-                <w:color w:val="000000" w:themeColor="text1"/>
-                <w:sz w:val="22"/>
-                <w:szCs w:val="22"/>
-              </w:rPr>
-            </w:pPr>
-            <w:r>
-              <w:rPr>
-                <w:b/>
-                <w:rFonts w:asciiTheme="majorHAnsi" w:eastAsia="Times New Roman" w:hAnsiTheme="majorHAnsi" w:cstheme="majorHAnsi"/>
-                <w:color w:val="000000" w:themeColor="text1"/>
-                <w:sz w:val="22"/>
-                <w:szCs w:val="22"/>
-              </w:rPr>
-              <w:t xml:space="preserve">Nội dung</w:t>
-            </w:r>
-          </w:p>
-        </w:tc>
-        <w:tc>
-          <w:tcPr>
-            <w:tcW w:w="3300" w:type="dxa"/>
-            <w:tcBorders>
-              <w:top w:val="single" w:sz="4" w:space="0" w:color="auto"/>
-              <w:left w:val="nil"/>
-              <w:bottom w:val="single" w:sz="4" w:space="0" w:color="auto"/>
-              <w:right w:val="single" w:sz="4" w:space="0" w:color="auto"/>
-            </w:tcBorders>
-            <w:noWrap/>
-            <w:vAlign w:val="center"/>
-            <w:hideMark/>
-          </w:tcPr>
-          <w:p>
-            <w:pPr>
-              <w:spacing w:before="0" w:after="0" w:line="240" w:lineRule="auto"/>
-              <w:ind w:left="0"/>
-              <w:jc w:val="center"/>
-              <w:rPr>
-                <w:rFonts w:asciiTheme="majorHAnsi" w:eastAsia="Times New Roman" w:hAnsiTheme="majorHAnsi" w:cstheme="majorHAnsi"/>
-                <w:b/>
-                <w:bCs/>
-                <w:color w:val="000000" w:themeColor="text1"/>
-                <w:sz w:val="22"/>
-                <w:szCs w:val="22"/>
-              </w:rPr>
-            </w:pPr>
-            <w:r>
-              <w:rPr>
-                <w:b/>
-                <w:rFonts w:asciiTheme="majorHAnsi" w:eastAsia="Times New Roman" w:hAnsiTheme="majorHAnsi" w:cstheme="majorHAnsi"/>
-                <w:color w:val="000000" w:themeColor="text1"/>
-                <w:sz w:val="22"/>
-                <w:szCs w:val="22"/>
-              </w:rPr>
-              <w:t xml:space="preserve">Tờ trình R5 (đã duyệt)</w:t>
-            </w:r>
-          </w:p>
-        </w:tc>
-        <w:tc>
-          <w:tcPr>
-            <w:tcW w:w="4169" w:type="dxa"/>
-            <w:tcBorders>
-              <w:top w:val="single" w:sz="4" w:space="0" w:color="auto"/>
-              <w:left w:val="nil"/>
-              <w:bottom w:val="single" w:sz="4" w:space="0" w:color="auto"/>
-              <w:right w:val="single" w:sz="4" w:space="0" w:color="auto"/>
-            </w:tcBorders>
-            <w:noWrap/>
-            <w:vAlign w:val="center"/>
-            <w:hideMark/>
-          </w:tcPr>
-          <w:p>
-            <w:pPr>
-              <w:spacing w:before="0" w:after="0" w:line="240" w:lineRule="auto"/>
-              <w:ind w:left="0"/>
-              <w:jc w:val="center"/>
-              <w:rPr>
-                <w:rFonts w:asciiTheme="majorHAnsi" w:eastAsia="Times New Roman" w:hAnsiTheme="majorHAnsi" w:cstheme="majorHAnsi"/>
-                <w:b/>
-                <w:bCs/>
-                <w:color w:val="000000" w:themeColor="text1"/>
-                <w:sz w:val="22"/>
-                <w:szCs w:val="22"/>
-              </w:rPr>
-            </w:pPr>
-            <w:r>
-              <w:rPr>
-                <w:b/>
-                <w:rFonts w:asciiTheme="majorHAnsi" w:eastAsia="Times New Roman" w:hAnsiTheme="majorHAnsi" w:cstheme="majorHAnsi"/>
-                <w:color w:val="000000" w:themeColor="text1"/>
-                <w:sz w:val="22"/>
-                <w:szCs w:val="22"/>
-              </w:rPr>
-              <w:t xml:space="preserve">Kết quả đàm phán 08/10 / HĐ R7</w:t>
-            </w:r>
-          </w:p>
-        </w:tc>
-      </w:tr>
-      <w:tr>
-        <w:trPr>
-          <w:trHeight w:val="630"/>
-        </w:trPr>
-        <w:tc>
-          <w:tcPr>
-            <w:tcW w:w="700" w:type="dxa"/>
-            <w:tcBorders>
-              <w:top w:val="nil"/>
-              <w:left w:val="nil"/>
-              <w:bottom w:val="single" w:sz="4" w:space="0" w:color="auto"/>
-              <w:right w:val="single" w:sz="4" w:space="0" w:color="auto"/>
-            </w:tcBorders>
-            <w:vAlign w:val="center"/>
-            <w:hideMark/>
-          </w:tcPr>
-          <w:p>
-            <w:pPr>
-              <w:spacing w:before="0" w:after="0" w:line="240" w:lineRule="auto"/>
-              <w:ind w:left="0"/>
-              <w:jc w:val="center"/>
-              <w:rPr>
-                <w:rFonts w:asciiTheme="majorHAnsi" w:eastAsia="Times New Roman" w:hAnsiTheme="majorHAnsi" w:cstheme="majorHAnsi"/>
-                <w:b/>
-                <w:bCs/>
-                <w:color w:val="000000" w:themeColor="text1"/>
-                <w:sz w:val="22"/>
-                <w:szCs w:val="22"/>
-              </w:rPr>
-            </w:pPr>
-            <w:r>
-              <w:rPr>
-                <w:rFonts w:asciiTheme="majorHAnsi" w:eastAsia="Times New Roman" w:hAnsiTheme="majorHAnsi" w:cstheme="majorHAnsi"/>
-                <w:color w:val="000000" w:themeColor="text1"/>
-                <w:sz w:val="22"/>
-                <w:szCs w:val="22"/>
-              </w:rPr>
-              <w:t xml:space="preserve">1</w:t>
-            </w:r>
-          </w:p>
-        </w:tc>
-        <w:tc>
-          <w:tcPr>
-            <w:tcW w:w="2000" w:type="dxa"/>
-            <w:tcBorders>
-              <w:top w:val="nil"/>
-              <w:left w:val="nil"/>
-              <w:bottom w:val="single" w:sz="4" w:space="0" w:color="auto"/>
-              <w:right w:val="single" w:sz="4" w:space="0" w:color="auto"/>
-            </w:tcBorders>
-            <w:vAlign w:val="center"/>
-            <w:hideMark/>
-          </w:tcPr>
-          <w:p>
-            <w:pPr>
-              <w:spacing w:before="0" w:after="0" w:line="240" w:lineRule="auto"/>
-              <w:ind w:left="0"/>
-              <w:jc w:val="left"/>
-              <w:rPr>
-                <w:rFonts w:asciiTheme="majorHAnsi" w:eastAsia="Times New Roman" w:hAnsiTheme="majorHAnsi" w:cstheme="majorHAnsi"/>
-                <w:b/>
-                <w:bCs/>
-                <w:color w:val="000000" w:themeColor="text1"/>
-                <w:sz w:val="22"/>
-                <w:szCs w:val="22"/>
-              </w:rPr>
-            </w:pPr>
-            <w:r>
-              <w:rPr>
-                <w:rFonts w:asciiTheme="majorHAnsi" w:eastAsia="Times New Roman" w:hAnsiTheme="majorHAnsi" w:cstheme="majorHAnsi"/>
-                <w:color w:val="000000" w:themeColor="text1"/>
-                <w:sz w:val="22"/>
-                <w:szCs w:val="22"/>
-              </w:rPr>
-              <w:t xml:space="preserve">Phạm vi</w:t>
-            </w:r>
-          </w:p>
-        </w:tc>
-        <w:tc>
-          <w:tcPr>
-            <w:tcW w:w="3300" w:type="dxa"/>
-            <w:tcBorders>
-              <w:top w:val="nil"/>
-              <w:left w:val="nil"/>
-              <w:bottom w:val="single" w:sz="4" w:space="0" w:color="auto"/>
-              <w:right w:val="single" w:sz="4" w:space="0" w:color="auto"/>
-            </w:tcBorders>
-            <w:vAlign w:val="center"/>
-            <w:hideMark/>
-          </w:tcPr>
-          <w:p>
-            <w:pPr>
-              <w:spacing w:before="0" w:after="0" w:line="240" w:lineRule="auto"/>
-              <w:ind w:left="0"/>
-              <w:jc w:val="left"/>
-              <w:rPr>
-                <w:rFonts w:asciiTheme="majorHAnsi" w:eastAsia="Times New Roman" w:hAnsiTheme="majorHAnsi" w:cstheme="majorHAnsi"/>
-                <w:b/>
-                <w:bCs/>
-                <w:color w:val="000000" w:themeColor="text1"/>
-                <w:sz w:val="22"/>
-                <w:szCs w:val="22"/>
-              </w:rPr>
-            </w:pPr>
-            <w:r>
-              <w:rPr>
-                <w:rFonts w:asciiTheme="majorHAnsi" w:eastAsia="Times New Roman" w:hAnsiTheme="majorHAnsi" w:cstheme="majorHAnsi"/>
-                <w:color w:val="000000" w:themeColor="text1"/>
-                <w:sz w:val="22"/>
-                <w:szCs w:val="22"/>
-              </w:rPr>
-              <w:t xml:space="preserve">Vét, vận chuyển mùn khoan; bóc đất lấp cao hơn cốt +4.3 (phần thuộc Hà Quỳnh)</w:t>
-            </w:r>
-          </w:p>
-        </w:tc>
-        <w:tc>
-          <w:tcPr>
-            <w:tcW w:w="4169" w:type="dxa"/>
-            <w:tcBorders>
-              <w:top w:val="nil"/>
-              <w:left w:val="nil"/>
-              <w:bottom w:val="single" w:sz="4" w:space="0" w:color="auto"/>
-              <w:right w:val="single" w:sz="4" w:space="0" w:color="auto"/>
-            </w:tcBorders>
-            <w:vAlign w:val="center"/>
-            <w:hideMark/>
-          </w:tcPr>
-          <w:p>
-            <w:pPr>
-              <w:spacing w:before="0" w:after="0" w:line="240" w:lineRule="auto"/>
-              <w:ind w:left="0"/>
-              <w:jc w:val="left"/>
-              <w:rPr>
-                <w:rFonts w:asciiTheme="majorHAnsi" w:eastAsia="Times New Roman" w:hAnsiTheme="majorHAnsi" w:cstheme="majorHAnsi"/>
-                <w:b/>
-                <w:bCs/>
-                <w:color w:val="000000" w:themeColor="text1"/>
-                <w:sz w:val="22"/>
-                <w:szCs w:val="22"/>
-              </w:rPr>
-            </w:pPr>
-            <w:r>
-              <w:rPr>
-                <w:rFonts w:asciiTheme="majorHAnsi" w:eastAsia="Times New Roman" w:hAnsiTheme="majorHAnsi" w:cstheme="majorHAnsi"/>
-                <w:color w:val="000000" w:themeColor="text1"/>
-                <w:sz w:val="22"/>
-                <w:szCs w:val="22"/>
-              </w:rPr>
-              <w:t xml:space="preserve">Vận chuyển mùn khoan; </w:t>
-            </w:r>
-            <w:r>
-              <w:rPr>
-                <w:b/>
-                <w:rFonts w:asciiTheme="majorHAnsi" w:eastAsia="Times New Roman" w:hAnsiTheme="majorHAnsi" w:cstheme="majorHAnsi"/>
-                <w:color w:val="000000" w:themeColor="text1"/>
-                <w:sz w:val="22"/>
-                <w:szCs w:val="22"/>
-              </w:rPr>
-              <w:t xml:space="preserve">đào hố móng</w:t>
-            </w:r>
-            <w:r>
-              <w:rPr>
-                <w:rFonts w:asciiTheme="majorHAnsi" w:eastAsia="Times New Roman" w:hAnsiTheme="majorHAnsi" w:cstheme="majorHAnsi"/>
-                <w:color w:val="000000" w:themeColor="text1"/>
-                <w:sz w:val="22"/>
-                <w:szCs w:val="22"/>
-              </w:rPr>
-              <w:t xml:space="preserve"> (cắt từ Phục Hưng). </w:t>
-            </w:r>
-            <w:r>
-              <w:rPr>
-                <w:rFonts w:asciiTheme="majorHAnsi" w:eastAsia="Times New Roman" w:hAnsiTheme="majorHAnsi" w:cstheme="majorHAnsi"/>
-                <w:color w:val="000000" w:themeColor="text1"/>
-                <w:sz w:val="22"/>
-                <w:szCs w:val="22"/>
-                <w:highlight w:val="yellow"/>
-              </w:rPr>
-              <w:t xml:space="preserve">Bóc đất cao hơn +4.3: giữ/bỏ</w:t>
-            </w:r>
-          </w:p>
-        </w:tc>
-      </w:tr>
-      <w:tr>
-        <w:trPr>
-          <w:trHeight w:val="630"/>
-        </w:trPr>
-        <w:tc>
-          <w:tcPr>
-            <w:tcW w:w="700" w:type="dxa"/>
-            <w:tcBorders>
-              <w:top w:val="nil"/>
-              <w:left w:val="nil"/>
-              <w:bottom w:val="single" w:sz="4" w:space="0" w:color="auto"/>
-              <w:right w:val="single" w:sz="4" w:space="0" w:color="auto"/>
-            </w:tcBorders>
-            <w:vAlign w:val="center"/>
-            <w:hideMark/>
-          </w:tcPr>
-          <w:p>
-            <w:pPr>
-              <w:spacing w:before="0" w:after="0" w:line="240" w:lineRule="auto"/>
-              <w:ind w:left="0"/>
-              <w:jc w:val="center"/>
-              <w:rPr>
-                <w:rFonts w:asciiTheme="majorHAnsi" w:eastAsia="Times New Roman" w:hAnsiTheme="majorHAnsi" w:cstheme="majorHAnsi"/>
-                <w:b/>
-                <w:bCs/>
-                <w:color w:val="000000" w:themeColor="text1"/>
-                <w:sz w:val="22"/>
-                <w:szCs w:val="22"/>
-              </w:rPr>
-            </w:pPr>
-            <w:r>
-              <w:rPr>
-                <w:rFonts w:asciiTheme="majorHAnsi" w:eastAsia="Times New Roman" w:hAnsiTheme="majorHAnsi" w:cstheme="majorHAnsi"/>
-                <w:color w:val="000000" w:themeColor="text1"/>
-                <w:sz w:val="22"/>
-                <w:szCs w:val="22"/>
-              </w:rPr>
-              <w:t xml:space="preserve">2</w:t>
-            </w:r>
-          </w:p>
-        </w:tc>
-        <w:tc>
-          <w:tcPr>
-            <w:tcW w:w="2000" w:type="dxa"/>
-            <w:tcBorders>
-              <w:top w:val="nil"/>
-              <w:left w:val="nil"/>
-              <w:bottom w:val="single" w:sz="4" w:space="0" w:color="auto"/>
-              <w:right w:val="single" w:sz="4" w:space="0" w:color="auto"/>
-            </w:tcBorders>
-            <w:vAlign w:val="center"/>
-            <w:hideMark/>
-          </w:tcPr>
-          <w:p>
-            <w:pPr>
-              <w:spacing w:before="0" w:after="0" w:line="240" w:lineRule="auto"/>
-              <w:ind w:left="0"/>
-              <w:jc w:val="left"/>
-              <w:rPr>
-                <w:rFonts w:asciiTheme="majorHAnsi" w:eastAsia="Times New Roman" w:hAnsiTheme="majorHAnsi" w:cstheme="majorHAnsi"/>
-                <w:b/>
-                <w:bCs/>
-                <w:color w:val="000000" w:themeColor="text1"/>
-                <w:sz w:val="22"/>
-                <w:szCs w:val="22"/>
-              </w:rPr>
-            </w:pPr>
-            <w:r>
-              <w:rPr>
-                <w:rFonts w:asciiTheme="majorHAnsi" w:eastAsia="Times New Roman" w:hAnsiTheme="majorHAnsi" w:cstheme="majorHAnsi"/>
-                <w:color w:val="000000" w:themeColor="text1"/>
-                <w:sz w:val="22"/>
-                <w:szCs w:val="22"/>
-              </w:rPr>
-              <w:t xml:space="preserve">Giá trị</w:t>
-            </w:r>
-          </w:p>
-        </w:tc>
-        <w:tc>
-          <w:tcPr>
-            <w:tcW w:w="3300" w:type="dxa"/>
-            <w:tcBorders>
-              <w:top w:val="nil"/>
-              <w:left w:val="nil"/>
-              <w:bottom w:val="single" w:sz="4" w:space="0" w:color="auto"/>
-              <w:right w:val="single" w:sz="4" w:space="0" w:color="auto"/>
-            </w:tcBorders>
-            <w:vAlign w:val="center"/>
-            <w:hideMark/>
-          </w:tcPr>
-          <w:p>
-            <w:pPr>
-              <w:spacing w:before="0" w:after="0" w:line="240" w:lineRule="auto"/>
-              <w:ind w:left="0"/>
-              <w:jc w:val="left"/>
-              <w:rPr>
-                <w:rFonts w:asciiTheme="majorHAnsi" w:eastAsia="Times New Roman" w:hAnsiTheme="majorHAnsi" w:cstheme="majorHAnsi"/>
-                <w:b/>
-                <w:bCs/>
-                <w:color w:val="000000" w:themeColor="text1"/>
-                <w:sz w:val="22"/>
-                <w:szCs w:val="22"/>
-              </w:rPr>
-            </w:pPr>
-            <w:r>
-              <w:rPr>
-                <w:rFonts w:asciiTheme="majorHAnsi" w:eastAsia="Times New Roman" w:hAnsiTheme="majorHAnsi" w:cstheme="majorHAnsi"/>
-                <w:color w:val="000000" w:themeColor="text1"/>
-                <w:sz w:val="22"/>
-                <w:szCs w:val="22"/>
-              </w:rPr>
-              <w:t xml:space="preserve">5.947.188.000 đ</w:t>
-            </w:r>
-          </w:p>
-        </w:tc>
-        <w:tc>
-          <w:tcPr>
-            <w:tcW w:w="4169" w:type="dxa"/>
-            <w:tcBorders>
-              <w:top w:val="nil"/>
-              <w:left w:val="nil"/>
-              <w:bottom w:val="single" w:sz="4" w:space="0" w:color="auto"/>
-              <w:right w:val="single" w:sz="4" w:space="0" w:color="auto"/>
-            </w:tcBorders>
-            <w:vAlign w:val="center"/>
-            <w:hideMark/>
-          </w:tcPr>
-          <w:p>
-            <w:pPr>
-              <w:spacing w:before="0" w:after="0" w:line="240" w:lineRule="auto"/>
-              <w:ind w:left="0"/>
-              <w:jc w:val="left"/>
-              <w:rPr>
-                <w:rFonts w:asciiTheme="majorHAnsi" w:eastAsia="Times New Roman" w:hAnsiTheme="majorHAnsi" w:cstheme="majorHAnsi"/>
-                <w:b/>
-                <w:bCs/>
-                <w:color w:val="000000" w:themeColor="text1"/>
-                <w:sz w:val="22"/>
-                <w:szCs w:val="22"/>
-              </w:rPr>
-            </w:pPr>
-            <w:r>
-              <w:rPr>
-                <w:rFonts w:asciiTheme="majorHAnsi" w:eastAsia="Times New Roman" w:hAnsiTheme="majorHAnsi" w:cstheme="majorHAnsi"/>
-                <w:color w:val="000000" w:themeColor="text1"/>
-                <w:sz w:val="22"/>
-                <w:szCs w:val="22"/>
-                <w:highlight w:val="yellow"/>
-              </w:rPr>
-              <w:t xml:space="preserve">……</w:t>
-            </w:r>
-            <w:r>
-              <w:rPr>
-                <w:rFonts w:asciiTheme="majorHAnsi" w:eastAsia="Times New Roman" w:hAnsiTheme="majorHAnsi" w:cstheme="majorHAnsi"/>
-                <w:color w:val="000000" w:themeColor="text1"/>
-                <w:sz w:val="22"/>
-                <w:szCs w:val="22"/>
-              </w:rPr>
-              <w:t xml:space="preserve"> đ; đơn giá cố định, thanh toán theo khối lượng đo cao độ thực tế</w:t>
-            </w:r>
-          </w:p>
-        </w:tc>
-      </w:tr>
-      <w:tr>
-        <w:trPr>
-          <w:trHeight w:val="630"/>
-        </w:trPr>
-        <w:tc>
-          <w:tcPr>
-            <w:tcW w:w="700" w:type="dxa"/>
-            <w:tcBorders>
-              <w:top w:val="nil"/>
-              <w:left w:val="nil"/>
-              <w:bottom w:val="single" w:sz="4" w:space="0" w:color="auto"/>
-              <w:right w:val="single" w:sz="4" w:space="0" w:color="auto"/>
-            </w:tcBorders>
-            <w:vAlign w:val="center"/>
-            <w:hideMark/>
-          </w:tcPr>
-          <w:p>
-            <w:pPr>
-              <w:spacing w:before="0" w:after="0" w:line="240" w:lineRule="auto"/>
-              <w:ind w:left="0"/>
-              <w:jc w:val="center"/>
-              <w:rPr>
-                <w:rFonts w:asciiTheme="majorHAnsi" w:eastAsia="Times New Roman" w:hAnsiTheme="majorHAnsi" w:cstheme="majorHAnsi"/>
-                <w:b/>
-                <w:bCs/>
-                <w:color w:val="000000" w:themeColor="text1"/>
-                <w:sz w:val="22"/>
-                <w:szCs w:val="22"/>
-              </w:rPr>
-            </w:pPr>
-            <w:r>
-              <w:rPr>
-                <w:rFonts w:asciiTheme="majorHAnsi" w:eastAsia="Times New Roman" w:hAnsiTheme="majorHAnsi" w:cstheme="majorHAnsi"/>
-                <w:color w:val="000000" w:themeColor="text1"/>
-                <w:sz w:val="22"/>
-                <w:szCs w:val="22"/>
-              </w:rPr>
-              <w:t xml:space="preserve">3</w:t>
-            </w:r>
-          </w:p>
-        </w:tc>
-        <w:tc>
-          <w:tcPr>
-            <w:tcW w:w="2000" w:type="dxa"/>
-            <w:tcBorders>
-              <w:top w:val="nil"/>
-              <w:left w:val="nil"/>
-              <w:bottom w:val="single" w:sz="4" w:space="0" w:color="auto"/>
-              <w:right w:val="single" w:sz="4" w:space="0" w:color="auto"/>
-            </w:tcBorders>
-            <w:vAlign w:val="center"/>
-            <w:hideMark/>
-          </w:tcPr>
-          <w:p>
-            <w:pPr>
-              <w:spacing w:before="0" w:after="0" w:line="240" w:lineRule="auto"/>
-              <w:ind w:left="0"/>
-              <w:jc w:val="left"/>
-              <w:rPr>
-                <w:rFonts w:asciiTheme="majorHAnsi" w:eastAsia="Times New Roman" w:hAnsiTheme="majorHAnsi" w:cstheme="majorHAnsi"/>
-                <w:b/>
-                <w:bCs/>
-                <w:color w:val="000000" w:themeColor="text1"/>
-                <w:sz w:val="22"/>
-                <w:szCs w:val="22"/>
-              </w:rPr>
-            </w:pPr>
-            <w:r>
-              <w:rPr>
-                <w:rFonts w:asciiTheme="majorHAnsi" w:eastAsia="Times New Roman" w:hAnsiTheme="majorHAnsi" w:cstheme="majorHAnsi"/>
-                <w:color w:val="000000" w:themeColor="text1"/>
-                <w:sz w:val="22"/>
-                <w:szCs w:val="22"/>
-              </w:rPr>
-              <w:t xml:space="preserve">Bãi đổ</w:t>
-            </w:r>
-          </w:p>
-        </w:tc>
-        <w:tc>
-          <w:tcPr>
-            <w:tcW w:w="3300" w:type="dxa"/>
-            <w:tcBorders>
-              <w:top w:val="nil"/>
-              <w:left w:val="nil"/>
-              <w:bottom w:val="single" w:sz="4" w:space="0" w:color="auto"/>
-              <w:right w:val="single" w:sz="4" w:space="0" w:color="auto"/>
-            </w:tcBorders>
-            <w:vAlign w:val="center"/>
-            <w:hideMark/>
-          </w:tcPr>
-          <w:p>
-            <w:pPr>
-              <w:spacing w:before="0" w:after="0" w:line="240" w:lineRule="auto"/>
-              <w:ind w:left="0"/>
-              <w:jc w:val="left"/>
-              <w:rPr>
-                <w:rFonts w:asciiTheme="majorHAnsi" w:eastAsia="Times New Roman" w:hAnsiTheme="majorHAnsi" w:cstheme="majorHAnsi"/>
-                <w:b/>
-                <w:bCs/>
-                <w:color w:val="000000" w:themeColor="text1"/>
-                <w:sz w:val="22"/>
-                <w:szCs w:val="22"/>
-              </w:rPr>
-            </w:pPr>
-            <w:r>
-              <w:rPr>
-                <w:rFonts w:asciiTheme="majorHAnsi" w:eastAsia="Times New Roman" w:hAnsiTheme="majorHAnsi" w:cstheme="majorHAnsi"/>
-                <w:color w:val="000000" w:themeColor="text1"/>
-                <w:sz w:val="22"/>
-                <w:szCs w:val="22"/>
-              </w:rPr>
-              <w:t xml:space="preserve">Nguyên Khê, 29 km</w:t>
-            </w:r>
-          </w:p>
-        </w:tc>
-        <w:tc>
-          <w:tcPr>
-            <w:tcW w:w="4169" w:type="dxa"/>
-            <w:tcBorders>
-              <w:top w:val="nil"/>
-              <w:left w:val="nil"/>
-              <w:bottom w:val="single" w:sz="4" w:space="0" w:color="auto"/>
-              <w:right w:val="single" w:sz="4" w:space="0" w:color="auto"/>
-            </w:tcBorders>
-            <w:vAlign w:val="center"/>
-            <w:hideMark/>
-          </w:tcPr>
-          <w:p>
-            <w:pPr>
-              <w:spacing w:before="0" w:after="0" w:line="240" w:lineRule="auto"/>
-              <w:ind w:left="0"/>
-              <w:jc w:val="left"/>
-              <w:rPr>
-                <w:rFonts w:asciiTheme="majorHAnsi" w:eastAsia="Times New Roman" w:hAnsiTheme="majorHAnsi" w:cstheme="majorHAnsi"/>
-                <w:b/>
-                <w:bCs/>
-                <w:color w:val="000000" w:themeColor="text1"/>
-                <w:sz w:val="22"/>
-                <w:szCs w:val="22"/>
-              </w:rPr>
-            </w:pPr>
-            <w:r>
-              <w:rPr>
-                <w:rFonts w:asciiTheme="majorHAnsi" w:eastAsia="Times New Roman" w:hAnsiTheme="majorHAnsi" w:cstheme="majorHAnsi"/>
-                <w:color w:val="000000" w:themeColor="text1"/>
-                <w:sz w:val="22"/>
-                <w:szCs w:val="22"/>
-              </w:rPr>
-              <w:t xml:space="preserve">Giữ nguyên; Hoàng Minh đã có hợp đồng với bãi</w:t>
-            </w:r>
-          </w:p>
-        </w:tc>
-      </w:tr>
-      <w:tr>
-        <w:trPr>
-          <w:trHeight w:val="630"/>
-        </w:trPr>
-        <w:tc>
-          <w:tcPr>
-            <w:tcW w:w="700" w:type="dxa"/>
-            <w:tcBorders>
-              <w:top w:val="nil"/>
-              <w:left w:val="nil"/>
-              <w:bottom w:val="single" w:sz="4" w:space="0" w:color="auto"/>
-              <w:right w:val="single" w:sz="4" w:space="0" w:color="auto"/>
-            </w:tcBorders>
-            <w:vAlign w:val="center"/>
-            <w:hideMark/>
-          </w:tcPr>
-          <w:p>
-            <w:pPr>
-              <w:spacing w:before="0" w:after="0" w:line="240" w:lineRule="auto"/>
-              <w:ind w:left="0"/>
-              <w:jc w:val="center"/>
-              <w:rPr>
-                <w:rFonts w:asciiTheme="majorHAnsi" w:eastAsia="Times New Roman" w:hAnsiTheme="majorHAnsi" w:cstheme="majorHAnsi"/>
-                <w:b/>
-                <w:bCs/>
-                <w:color w:val="000000" w:themeColor="text1"/>
-                <w:sz w:val="22"/>
-                <w:szCs w:val="22"/>
-              </w:rPr>
-            </w:pPr>
-            <w:r>
-              <w:rPr>
-                <w:rFonts w:asciiTheme="majorHAnsi" w:eastAsia="Times New Roman" w:hAnsiTheme="majorHAnsi" w:cstheme="majorHAnsi"/>
-                <w:color w:val="000000" w:themeColor="text1"/>
-                <w:sz w:val="22"/>
-                <w:szCs w:val="22"/>
-              </w:rPr>
-              <w:t xml:space="preserve">4</w:t>
-            </w:r>
-          </w:p>
-        </w:tc>
-        <w:tc>
-          <w:tcPr>
-            <w:tcW w:w="2000" w:type="dxa"/>
-            <w:tcBorders>
-              <w:top w:val="nil"/>
-              <w:left w:val="nil"/>
-              <w:bottom w:val="single" w:sz="4" w:space="0" w:color="auto"/>
-              <w:right w:val="single" w:sz="4" w:space="0" w:color="auto"/>
-            </w:tcBorders>
-            <w:vAlign w:val="center"/>
-            <w:hideMark/>
-          </w:tcPr>
-          <w:p>
-            <w:pPr>
-              <w:spacing w:before="0" w:after="0" w:line="240" w:lineRule="auto"/>
-              <w:ind w:left="0"/>
-              <w:jc w:val="left"/>
-              <w:rPr>
-                <w:rFonts w:asciiTheme="majorHAnsi" w:eastAsia="Times New Roman" w:hAnsiTheme="majorHAnsi" w:cstheme="majorHAnsi"/>
-                <w:b/>
-                <w:bCs/>
-                <w:color w:val="000000" w:themeColor="text1"/>
-                <w:sz w:val="22"/>
-                <w:szCs w:val="22"/>
-              </w:rPr>
-            </w:pPr>
-            <w:r>
-              <w:rPr>
-                <w:rFonts w:asciiTheme="majorHAnsi" w:eastAsia="Times New Roman" w:hAnsiTheme="majorHAnsi" w:cstheme="majorHAnsi"/>
-                <w:color w:val="000000" w:themeColor="text1"/>
-                <w:sz w:val="22"/>
-                <w:szCs w:val="22"/>
-              </w:rPr>
-              <w:t xml:space="preserve">Tạm ứng</w:t>
-            </w:r>
-          </w:p>
-        </w:tc>
-        <w:tc>
-          <w:tcPr>
-            <w:tcW w:w="3300" w:type="dxa"/>
-            <w:tcBorders>
-              <w:top w:val="nil"/>
-              <w:left w:val="nil"/>
-              <w:bottom w:val="single" w:sz="4" w:space="0" w:color="auto"/>
-              <w:right w:val="single" w:sz="4" w:space="0" w:color="auto"/>
-            </w:tcBorders>
-            <w:vAlign w:val="center"/>
-            <w:hideMark/>
-          </w:tcPr>
-          <w:p>
-            <w:pPr>
-              <w:spacing w:before="0" w:after="0" w:line="240" w:lineRule="auto"/>
-              <w:ind w:left="0"/>
-              <w:jc w:val="left"/>
-              <w:rPr>
-                <w:rFonts w:asciiTheme="majorHAnsi" w:eastAsia="Times New Roman" w:hAnsiTheme="majorHAnsi" w:cstheme="majorHAnsi"/>
-                <w:b/>
-                <w:bCs/>
-                <w:color w:val="000000" w:themeColor="text1"/>
-                <w:sz w:val="22"/>
-                <w:szCs w:val="22"/>
-              </w:rPr>
-            </w:pPr>
-            <w:r>
-              <w:rPr>
-                <w:rFonts w:asciiTheme="majorHAnsi" w:eastAsia="Times New Roman" w:hAnsiTheme="majorHAnsi" w:cstheme="majorHAnsi"/>
-                <w:color w:val="000000" w:themeColor="text1"/>
-                <w:sz w:val="22"/>
-                <w:szCs w:val="22"/>
-              </w:rPr>
-              <w:t xml:space="preserve">250 triệu khi đủ 05 thiết bị và HĐ bãi đổ</w:t>
-            </w:r>
-          </w:p>
-        </w:tc>
-        <w:tc>
-          <w:tcPr>
-            <w:tcW w:w="4169" w:type="dxa"/>
-            <w:tcBorders>
-              <w:top w:val="nil"/>
-              <w:left w:val="nil"/>
-              <w:bottom w:val="single" w:sz="4" w:space="0" w:color="auto"/>
-              <w:right w:val="single" w:sz="4" w:space="0" w:color="auto"/>
-            </w:tcBorders>
-            <w:vAlign w:val="center"/>
-            <w:hideMark/>
-          </w:tcPr>
-          <w:p>
-            <w:pPr>
-              <w:spacing w:before="0" w:after="0" w:line="240" w:lineRule="auto"/>
-              <w:ind w:left="0"/>
-              <w:jc w:val="left"/>
-              <w:rPr>
-                <w:rFonts w:asciiTheme="majorHAnsi" w:eastAsia="Times New Roman" w:hAnsiTheme="majorHAnsi" w:cstheme="majorHAnsi"/>
-                <w:b/>
-                <w:bCs/>
-                <w:color w:val="000000" w:themeColor="text1"/>
-                <w:sz w:val="22"/>
-                <w:szCs w:val="22"/>
-              </w:rPr>
-            </w:pPr>
-            <w:r>
-              <w:rPr>
-                <w:b/>
-                <w:rFonts w:asciiTheme="majorHAnsi" w:eastAsia="Times New Roman" w:hAnsiTheme="majorHAnsi" w:cstheme="majorHAnsi"/>
-                <w:color w:val="000000" w:themeColor="text1"/>
-                <w:sz w:val="22"/>
-                <w:szCs w:val="22"/>
-              </w:rPr>
-              <w:t xml:space="preserve">500 triệu</w:t>
-            </w:r>
-            <w:r>
-              <w:rPr>
-                <w:rFonts w:asciiTheme="majorHAnsi" w:eastAsia="Times New Roman" w:hAnsiTheme="majorHAnsi" w:cstheme="majorHAnsi"/>
-                <w:color w:val="000000" w:themeColor="text1"/>
-                <w:sz w:val="22"/>
-                <w:szCs w:val="22"/>
-              </w:rPr>
-              <w:t xml:space="preserve">, cùng điều kiện; thu hồi 20%/lần thanh toán</w:t>
-            </w:r>
-          </w:p>
-        </w:tc>
-      </w:tr>
-      <w:tr>
-        <w:trPr>
-          <w:trHeight w:val="630"/>
-        </w:trPr>
-        <w:tc>
-          <w:tcPr>
-            <w:tcW w:w="700" w:type="dxa"/>
-            <w:tcBorders>
-              <w:top w:val="nil"/>
-              <w:left w:val="nil"/>
-              <w:bottom w:val="single" w:sz="4" w:space="0" w:color="auto"/>
-              <w:right w:val="single" w:sz="4" w:space="0" w:color="auto"/>
-            </w:tcBorders>
-            <w:vAlign w:val="center"/>
-            <w:hideMark/>
-          </w:tcPr>
-          <w:p>
-            <w:pPr>
-              <w:spacing w:before="0" w:after="0" w:line="240" w:lineRule="auto"/>
-              <w:ind w:left="0"/>
-              <w:jc w:val="center"/>
-              <w:rPr>
-                <w:rFonts w:asciiTheme="majorHAnsi" w:eastAsia="Times New Roman" w:hAnsiTheme="majorHAnsi" w:cstheme="majorHAnsi"/>
-                <w:b/>
-                <w:bCs/>
-                <w:color w:val="000000" w:themeColor="text1"/>
-                <w:sz w:val="22"/>
-                <w:szCs w:val="22"/>
-              </w:rPr>
-            </w:pPr>
-            <w:r>
-              <w:rPr>
-                <w:rFonts w:asciiTheme="majorHAnsi" w:eastAsia="Times New Roman" w:hAnsiTheme="majorHAnsi" w:cstheme="majorHAnsi"/>
-                <w:color w:val="000000" w:themeColor="text1"/>
-                <w:sz w:val="22"/>
-                <w:szCs w:val="22"/>
-              </w:rPr>
-              <w:t xml:space="preserve">5</w:t>
-            </w:r>
-          </w:p>
-        </w:tc>
-        <w:tc>
-          <w:tcPr>
-            <w:tcW w:w="2000" w:type="dxa"/>
-            <w:tcBorders>
-              <w:top w:val="nil"/>
-              <w:left w:val="nil"/>
-              <w:bottom w:val="single" w:sz="4" w:space="0" w:color="auto"/>
-              <w:right w:val="single" w:sz="4" w:space="0" w:color="auto"/>
-            </w:tcBorders>
-            <w:vAlign w:val="center"/>
-            <w:hideMark/>
-          </w:tcPr>
-          <w:p>
-            <w:pPr>
-              <w:spacing w:before="0" w:after="0" w:line="240" w:lineRule="auto"/>
-              <w:ind w:left="0"/>
-              <w:jc w:val="left"/>
-              <w:rPr>
-                <w:rFonts w:asciiTheme="majorHAnsi" w:eastAsia="Times New Roman" w:hAnsiTheme="majorHAnsi" w:cstheme="majorHAnsi"/>
-                <w:b/>
-                <w:bCs/>
-                <w:color w:val="000000" w:themeColor="text1"/>
-                <w:sz w:val="22"/>
-                <w:szCs w:val="22"/>
-              </w:rPr>
-            </w:pPr>
-            <w:r>
-              <w:rPr>
-                <w:rFonts w:asciiTheme="majorHAnsi" w:eastAsia="Times New Roman" w:hAnsiTheme="majorHAnsi" w:cstheme="majorHAnsi"/>
-                <w:color w:val="000000" w:themeColor="text1"/>
-                <w:sz w:val="22"/>
-                <w:szCs w:val="22"/>
-              </w:rPr>
-              <w:t xml:space="preserve">Tạm ứng phí đổ thải</w:t>
-            </w:r>
-          </w:p>
-        </w:tc>
-        <w:tc>
-          <w:tcPr>
-            <w:tcW w:w="3300" w:type="dxa"/>
-            <w:tcBorders>
-              <w:top w:val="nil"/>
-              <w:left w:val="nil"/>
-              <w:bottom w:val="single" w:sz="4" w:space="0" w:color="auto"/>
-              <w:right w:val="single" w:sz="4" w:space="0" w:color="auto"/>
-            </w:tcBorders>
-            <w:vAlign w:val="center"/>
-            <w:hideMark/>
-          </w:tcPr>
-          <w:p>
-            <w:pPr>
-              <w:spacing w:before="0" w:after="0" w:line="240" w:lineRule="auto"/>
-              <w:ind w:left="0"/>
-              <w:jc w:val="left"/>
-              <w:rPr>
-                <w:rFonts w:asciiTheme="majorHAnsi" w:eastAsia="Times New Roman" w:hAnsiTheme="majorHAnsi" w:cstheme="majorHAnsi"/>
-                <w:b/>
-                <w:bCs/>
-                <w:color w:val="000000" w:themeColor="text1"/>
-                <w:sz w:val="22"/>
-                <w:szCs w:val="22"/>
-              </w:rPr>
-            </w:pPr>
-            <w:r>
-              <w:rPr>
-                <w:rFonts w:asciiTheme="majorHAnsi" w:eastAsia="Times New Roman" w:hAnsiTheme="majorHAnsi" w:cstheme="majorHAnsi"/>
-                <w:color w:val="000000" w:themeColor="text1"/>
-                <w:sz w:val="22"/>
-                <w:szCs w:val="22"/>
-              </w:rPr>
-              <w:t xml:space="preserve">Không có</w:t>
-            </w:r>
-          </w:p>
-        </w:tc>
-        <w:tc>
-          <w:tcPr>
-            <w:tcW w:w="4169" w:type="dxa"/>
-            <w:tcBorders>
-              <w:top w:val="nil"/>
-              <w:left w:val="nil"/>
-              <w:bottom w:val="single" w:sz="4" w:space="0" w:color="auto"/>
-              <w:right w:val="single" w:sz="4" w:space="0" w:color="auto"/>
-            </w:tcBorders>
-            <w:vAlign w:val="center"/>
-            <w:hideMark/>
-          </w:tcPr>
-          <w:p>
-            <w:pPr>
-              <w:spacing w:before="0" w:after="0" w:line="240" w:lineRule="auto"/>
-              <w:ind w:left="0"/>
-              <w:jc w:val="left"/>
-              <w:rPr>
-                <w:rFonts w:asciiTheme="majorHAnsi" w:eastAsia="Times New Roman" w:hAnsiTheme="majorHAnsi" w:cstheme="majorHAnsi"/>
-                <w:b/>
-                <w:bCs/>
-                <w:color w:val="000000" w:themeColor="text1"/>
-                <w:sz w:val="22"/>
-                <w:szCs w:val="22"/>
-              </w:rPr>
-            </w:pPr>
-            <w:r>
-              <w:rPr>
-                <w:b/>
-                <w:rFonts w:asciiTheme="majorHAnsi" w:eastAsia="Times New Roman" w:hAnsiTheme="majorHAnsi" w:cstheme="majorHAnsi"/>
-                <w:color w:val="000000" w:themeColor="text1"/>
-                <w:sz w:val="22"/>
-                <w:szCs w:val="22"/>
-              </w:rPr>
-              <w:t xml:space="preserve">Mới</w:t>
-            </w:r>
-            <w:r>
-              <w:rPr>
-                <w:rFonts w:asciiTheme="majorHAnsi" w:eastAsia="Times New Roman" w:hAnsiTheme="majorHAnsi" w:cstheme="majorHAnsi"/>
-                <w:color w:val="000000" w:themeColor="text1"/>
-                <w:sz w:val="22"/>
-                <w:szCs w:val="22"/>
-              </w:rPr>
-              <w:t xml:space="preserve">: KL xác nhận × 25.000 đ/m³ (mục 1)</w:t>
-            </w:r>
-          </w:p>
-        </w:tc>
-      </w:tr>
-      <w:tr>
-        <w:trPr>
-          <w:trHeight w:val="630"/>
-        </w:trPr>
-        <w:tc>
-          <w:tcPr>
-            <w:tcW w:w="700" w:type="dxa"/>
-            <w:tcBorders>
-              <w:top w:val="nil"/>
-              <w:left w:val="nil"/>
-              <w:bottom w:val="single" w:sz="4" w:space="0" w:color="auto"/>
-              <w:right w:val="single" w:sz="4" w:space="0" w:color="auto"/>
-            </w:tcBorders>
-            <w:vAlign w:val="center"/>
-            <w:hideMark/>
-          </w:tcPr>
-          <w:p>
-            <w:pPr>
-              <w:spacing w:before="0" w:after="0" w:line="240" w:lineRule="auto"/>
-              <w:ind w:left="0"/>
-              <w:jc w:val="center"/>
-              <w:rPr>
-                <w:rFonts w:asciiTheme="majorHAnsi" w:eastAsia="Times New Roman" w:hAnsiTheme="majorHAnsi" w:cstheme="majorHAnsi"/>
-                <w:b/>
-                <w:bCs/>
-                <w:color w:val="000000" w:themeColor="text1"/>
-                <w:sz w:val="22"/>
-                <w:szCs w:val="22"/>
-              </w:rPr>
-            </w:pPr>
-            <w:r>
-              <w:rPr>
-                <w:rFonts w:asciiTheme="majorHAnsi" w:eastAsia="Times New Roman" w:hAnsiTheme="majorHAnsi" w:cstheme="majorHAnsi"/>
-                <w:color w:val="000000" w:themeColor="text1"/>
-                <w:sz w:val="22"/>
-                <w:szCs w:val="22"/>
-              </w:rPr>
-              <w:t xml:space="preserve">6</w:t>
-            </w:r>
-          </w:p>
-        </w:tc>
-        <w:tc>
-          <w:tcPr>
-            <w:tcW w:w="2000" w:type="dxa"/>
-            <w:tcBorders>
-              <w:top w:val="nil"/>
-              <w:left w:val="nil"/>
-              <w:bottom w:val="single" w:sz="4" w:space="0" w:color="auto"/>
-              <w:right w:val="single" w:sz="4" w:space="0" w:color="auto"/>
-            </w:tcBorders>
-            <w:vAlign w:val="center"/>
-            <w:hideMark/>
-          </w:tcPr>
-          <w:p>
-            <w:pPr>
-              <w:spacing w:before="0" w:after="0" w:line="240" w:lineRule="auto"/>
-              <w:ind w:left="0"/>
-              <w:jc w:val="left"/>
-              <w:rPr>
-                <w:rFonts w:asciiTheme="majorHAnsi" w:eastAsia="Times New Roman" w:hAnsiTheme="majorHAnsi" w:cstheme="majorHAnsi"/>
-                <w:b/>
-                <w:bCs/>
-                <w:color w:val="000000" w:themeColor="text1"/>
-                <w:sz w:val="22"/>
-                <w:szCs w:val="22"/>
-              </w:rPr>
-            </w:pPr>
-            <w:r>
-              <w:rPr>
-                <w:rFonts w:asciiTheme="majorHAnsi" w:eastAsia="Times New Roman" w:hAnsiTheme="majorHAnsi" w:cstheme="majorHAnsi"/>
-                <w:color w:val="000000" w:themeColor="text1"/>
-                <w:sz w:val="22"/>
-                <w:szCs w:val="22"/>
-              </w:rPr>
-              <w:t xml:space="preserve">Cọc bãi đổ ~100 triệu</w:t>
-            </w:r>
-          </w:p>
-        </w:tc>
-        <w:tc>
-          <w:tcPr>
-            <w:tcW w:w="3300" w:type="dxa"/>
-            <w:tcBorders>
-              <w:top w:val="nil"/>
-              <w:left w:val="nil"/>
-              <w:bottom w:val="single" w:sz="4" w:space="0" w:color="auto"/>
-              <w:right w:val="single" w:sz="4" w:space="0" w:color="auto"/>
-            </w:tcBorders>
-            <w:vAlign w:val="center"/>
-            <w:hideMark/>
-          </w:tcPr>
-          <w:p>
-            <w:pPr>
-              <w:spacing w:before="0" w:after="0" w:line="240" w:lineRule="auto"/>
-              <w:ind w:left="0"/>
-              <w:jc w:val="left"/>
-              <w:rPr>
-                <w:rFonts w:asciiTheme="majorHAnsi" w:eastAsia="Times New Roman" w:hAnsiTheme="majorHAnsi" w:cstheme="majorHAnsi"/>
-                <w:b/>
-                <w:bCs/>
-                <w:color w:val="000000" w:themeColor="text1"/>
-                <w:sz w:val="22"/>
-                <w:szCs w:val="22"/>
-              </w:rPr>
-            </w:pPr>
-            <w:r>
-              <w:rPr>
-                <w:rFonts w:asciiTheme="majorHAnsi" w:eastAsia="Times New Roman" w:hAnsiTheme="majorHAnsi" w:cstheme="majorHAnsi"/>
-                <w:color w:val="000000" w:themeColor="text1"/>
-                <w:sz w:val="22"/>
-                <w:szCs w:val="22"/>
-              </w:rPr>
-              <w:t xml:space="preserve">Hoàng Minh tự trả; EC hoàn nếu không ký HĐ chính thức</w:t>
-            </w:r>
-          </w:p>
-        </w:tc>
-        <w:tc>
-          <w:tcPr>
-            <w:tcW w:w="4169" w:type="dxa"/>
-            <w:tcBorders>
-              <w:top w:val="nil"/>
-              <w:left w:val="nil"/>
-              <w:bottom w:val="single" w:sz="4" w:space="0" w:color="auto"/>
-              <w:right w:val="single" w:sz="4" w:space="0" w:color="auto"/>
-            </w:tcBorders>
-            <w:vAlign w:val="center"/>
-            <w:hideMark/>
-          </w:tcPr>
-          <w:p>
-            <w:pPr>
-              <w:spacing w:before="0" w:after="0" w:line="240" w:lineRule="auto"/>
-              <w:ind w:left="0"/>
-              <w:jc w:val="left"/>
-              <w:rPr>
-                <w:rFonts w:asciiTheme="majorHAnsi" w:eastAsia="Times New Roman" w:hAnsiTheme="majorHAnsi" w:cstheme="majorHAnsi"/>
-                <w:b/>
-                <w:bCs/>
-                <w:color w:val="000000" w:themeColor="text1"/>
-                <w:sz w:val="22"/>
-                <w:szCs w:val="22"/>
-              </w:rPr>
-            </w:pPr>
-            <w:r>
-              <w:rPr>
-                <w:rFonts w:asciiTheme="majorHAnsi" w:eastAsia="Times New Roman" w:hAnsiTheme="majorHAnsi" w:cstheme="majorHAnsi"/>
-                <w:color w:val="000000" w:themeColor="text1"/>
-                <w:sz w:val="22"/>
-                <w:szCs w:val="22"/>
-              </w:rPr>
-              <w:t xml:space="preserve">Không đưa vào HĐ</w:t>
-            </w:r>
-          </w:p>
-        </w:tc>
-      </w:tr>
-      <w:tr>
-        <w:trPr>
-          <w:trHeight w:val="630"/>
-        </w:trPr>
-        <w:tc>
-          <w:tcPr>
-            <w:tcW w:w="700" w:type="dxa"/>
-            <w:tcBorders>
-              <w:top w:val="nil"/>
-              <w:left w:val="nil"/>
-              <w:bottom w:val="single" w:sz="4" w:space="0" w:color="auto"/>
-              <w:right w:val="single" w:sz="4" w:space="0" w:color="auto"/>
-            </w:tcBorders>
-            <w:vAlign w:val="center"/>
-            <w:hideMark/>
-          </w:tcPr>
-          <w:p>
-            <w:pPr>
-              <w:spacing w:before="0" w:after="0" w:line="240" w:lineRule="auto"/>
-              <w:ind w:left="0"/>
-              <w:jc w:val="center"/>
-              <w:rPr>
-                <w:rFonts w:asciiTheme="majorHAnsi" w:eastAsia="Times New Roman" w:hAnsiTheme="majorHAnsi" w:cstheme="majorHAnsi"/>
-                <w:b/>
-                <w:bCs/>
-                <w:color w:val="000000" w:themeColor="text1"/>
-                <w:sz w:val="22"/>
-                <w:szCs w:val="22"/>
-              </w:rPr>
-            </w:pPr>
-            <w:r>
-              <w:rPr>
-                <w:rFonts w:asciiTheme="majorHAnsi" w:eastAsia="Times New Roman" w:hAnsiTheme="majorHAnsi" w:cstheme="majorHAnsi"/>
-                <w:color w:val="000000" w:themeColor="text1"/>
-                <w:sz w:val="22"/>
-                <w:szCs w:val="22"/>
-              </w:rPr>
-              <w:t xml:space="preserve">7</w:t>
-            </w:r>
-          </w:p>
-        </w:tc>
-        <w:tc>
-          <w:tcPr>
-            <w:tcW w:w="2000" w:type="dxa"/>
-            <w:tcBorders>
-              <w:top w:val="nil"/>
-              <w:left w:val="nil"/>
-              <w:bottom w:val="single" w:sz="4" w:space="0" w:color="auto"/>
-              <w:right w:val="single" w:sz="4" w:space="0" w:color="auto"/>
-            </w:tcBorders>
-            <w:vAlign w:val="center"/>
-            <w:hideMark/>
-          </w:tcPr>
-          <w:p>
-            <w:pPr>
-              <w:spacing w:before="0" w:after="0" w:line="240" w:lineRule="auto"/>
-              <w:ind w:left="0"/>
-              <w:jc w:val="left"/>
-              <w:rPr>
-                <w:rFonts w:asciiTheme="majorHAnsi" w:eastAsia="Times New Roman" w:hAnsiTheme="majorHAnsi" w:cstheme="majorHAnsi"/>
-                <w:b/>
-                <w:bCs/>
-                <w:color w:val="000000" w:themeColor="text1"/>
-                <w:sz w:val="22"/>
-                <w:szCs w:val="22"/>
-              </w:rPr>
-            </w:pPr>
-            <w:r>
-              <w:rPr>
-                <w:rFonts w:asciiTheme="majorHAnsi" w:eastAsia="Times New Roman" w:hAnsiTheme="majorHAnsi" w:cstheme="majorHAnsi"/>
-                <w:color w:val="000000" w:themeColor="text1"/>
-                <w:sz w:val="22"/>
-                <w:szCs w:val="22"/>
-              </w:rPr>
-              <w:t xml:space="preserve">Bảo lãnh</w:t>
-            </w:r>
-          </w:p>
-        </w:tc>
-        <w:tc>
-          <w:tcPr>
-            <w:tcW w:w="3300" w:type="dxa"/>
-            <w:tcBorders>
-              <w:top w:val="nil"/>
-              <w:left w:val="nil"/>
-              <w:bottom w:val="single" w:sz="4" w:space="0" w:color="auto"/>
-              <w:right w:val="single" w:sz="4" w:space="0" w:color="auto"/>
-            </w:tcBorders>
-            <w:vAlign w:val="center"/>
-            <w:hideMark/>
-          </w:tcPr>
-          <w:p>
-            <w:pPr>
-              <w:spacing w:before="0" w:after="0" w:line="240" w:lineRule="auto"/>
-              <w:ind w:left="0"/>
-              <w:jc w:val="left"/>
-              <w:rPr>
-                <w:rFonts w:asciiTheme="majorHAnsi" w:eastAsia="Times New Roman" w:hAnsiTheme="majorHAnsi" w:cstheme="majorHAnsi"/>
-                <w:b/>
-                <w:bCs/>
-                <w:color w:val="000000" w:themeColor="text1"/>
-                <w:sz w:val="22"/>
-                <w:szCs w:val="22"/>
-              </w:rPr>
-            </w:pPr>
-            <w:r>
-              <w:rPr>
-                <w:rFonts w:asciiTheme="majorHAnsi" w:eastAsia="Times New Roman" w:hAnsiTheme="majorHAnsi" w:cstheme="majorHAnsi"/>
-                <w:color w:val="000000" w:themeColor="text1"/>
-                <w:sz w:val="22"/>
-                <w:szCs w:val="22"/>
-              </w:rPr>
-              <w:t xml:space="preserve">Không áp dụng</w:t>
-            </w:r>
-          </w:p>
-        </w:tc>
-        <w:tc>
-          <w:tcPr>
-            <w:tcW w:w="4169" w:type="dxa"/>
-            <w:tcBorders>
-              <w:top w:val="nil"/>
-              <w:left w:val="nil"/>
-              <w:bottom w:val="single" w:sz="4" w:space="0" w:color="auto"/>
-              <w:right w:val="single" w:sz="4" w:space="0" w:color="auto"/>
-            </w:tcBorders>
-            <w:vAlign w:val="center"/>
-            <w:hideMark/>
-          </w:tcPr>
-          <w:p>
-            <w:pPr>
-              <w:spacing w:before="0" w:after="0" w:line="240" w:lineRule="auto"/>
-              <w:ind w:left="0"/>
-              <w:jc w:val="left"/>
-              <w:rPr>
-                <w:rFonts w:asciiTheme="majorHAnsi" w:eastAsia="Times New Roman" w:hAnsiTheme="majorHAnsi" w:cstheme="majorHAnsi"/>
-                <w:b/>
-                <w:bCs/>
-                <w:color w:val="000000" w:themeColor="text1"/>
-                <w:sz w:val="22"/>
-                <w:szCs w:val="22"/>
-              </w:rPr>
-            </w:pPr>
-            <w:r>
-              <w:rPr>
-                <w:rFonts w:asciiTheme="majorHAnsi" w:eastAsia="Times New Roman" w:hAnsiTheme="majorHAnsi" w:cstheme="majorHAnsi"/>
-                <w:color w:val="000000" w:themeColor="text1"/>
-                <w:sz w:val="22"/>
-                <w:szCs w:val="22"/>
-              </w:rPr>
-              <w:t xml:space="preserve">Không áp dụng; thiết bị không được rút khi chưa hoàn thành</w:t>
-            </w:r>
-          </w:p>
-        </w:tc>
-      </w:tr>
-      <w:tr>
-        <w:trPr>
-          <w:trHeight w:val="630"/>
-        </w:trPr>
-        <w:tc>
-          <w:tcPr>
-            <w:tcW w:w="700" w:type="dxa"/>
-            <w:tcBorders>
-              <w:top w:val="nil"/>
-              <w:left w:val="nil"/>
-              <w:bottom w:val="single" w:sz="4" w:space="0" w:color="auto"/>
-              <w:right w:val="single" w:sz="4" w:space="0" w:color="auto"/>
-            </w:tcBorders>
-            <w:vAlign w:val="center"/>
-            <w:hideMark/>
-          </w:tcPr>
-          <w:p>
-            <w:pPr>
-              <w:spacing w:before="0" w:after="0" w:line="240" w:lineRule="auto"/>
-              <w:ind w:left="0"/>
-              <w:jc w:val="center"/>
-              <w:rPr>
-                <w:rFonts w:asciiTheme="majorHAnsi" w:eastAsia="Times New Roman" w:hAnsiTheme="majorHAnsi" w:cstheme="majorHAnsi"/>
-                <w:b/>
-                <w:bCs/>
-                <w:color w:val="000000" w:themeColor="text1"/>
-                <w:sz w:val="22"/>
-                <w:szCs w:val="22"/>
-              </w:rPr>
-            </w:pPr>
-            <w:r>
-              <w:rPr>
-                <w:rFonts w:asciiTheme="majorHAnsi" w:eastAsia="Times New Roman" w:hAnsiTheme="majorHAnsi" w:cstheme="majorHAnsi"/>
-                <w:color w:val="000000" w:themeColor="text1"/>
-                <w:sz w:val="22"/>
-                <w:szCs w:val="22"/>
-              </w:rPr>
-              <w:t xml:space="preserve">8</w:t>
-            </w:r>
-          </w:p>
-        </w:tc>
-        <w:tc>
-          <w:tcPr>
-            <w:tcW w:w="2000" w:type="dxa"/>
-            <w:tcBorders>
-              <w:top w:val="nil"/>
-              <w:left w:val="nil"/>
-              <w:bottom w:val="single" w:sz="4" w:space="0" w:color="auto"/>
-              <w:right w:val="single" w:sz="4" w:space="0" w:color="auto"/>
-            </w:tcBorders>
-            <w:vAlign w:val="center"/>
-            <w:hideMark/>
-          </w:tcPr>
-          <w:p>
-            <w:pPr>
-              <w:spacing w:before="0" w:after="0" w:line="240" w:lineRule="auto"/>
-              <w:ind w:left="0"/>
-              <w:jc w:val="left"/>
-              <w:rPr>
-                <w:rFonts w:asciiTheme="majorHAnsi" w:eastAsia="Times New Roman" w:hAnsiTheme="majorHAnsi" w:cstheme="majorHAnsi"/>
-                <w:b/>
-                <w:bCs/>
-                <w:color w:val="000000" w:themeColor="text1"/>
-                <w:sz w:val="22"/>
-                <w:szCs w:val="22"/>
-              </w:rPr>
-            </w:pPr>
-            <w:r>
-              <w:rPr>
-                <w:rFonts w:asciiTheme="majorHAnsi" w:eastAsia="Times New Roman" w:hAnsiTheme="majorHAnsi" w:cstheme="majorHAnsi"/>
-                <w:color w:val="000000" w:themeColor="text1"/>
-                <w:sz w:val="22"/>
-                <w:szCs w:val="22"/>
-              </w:rPr>
-              <w:t xml:space="preserve">Thanh toán định kỳ</w:t>
-            </w:r>
-          </w:p>
-        </w:tc>
-        <w:tc>
-          <w:tcPr>
-            <w:tcW w:w="3300" w:type="dxa"/>
-            <w:tcBorders>
-              <w:top w:val="nil"/>
-              <w:left w:val="nil"/>
-              <w:bottom w:val="single" w:sz="4" w:space="0" w:color="auto"/>
-              <w:right w:val="single" w:sz="4" w:space="0" w:color="auto"/>
-            </w:tcBorders>
-            <w:vAlign w:val="center"/>
-            <w:hideMark/>
-          </w:tcPr>
-          <w:p>
-            <w:pPr>
-              <w:spacing w:before="0" w:after="0" w:line="240" w:lineRule="auto"/>
-              <w:ind w:left="0"/>
-              <w:jc w:val="left"/>
-              <w:rPr>
-                <w:rFonts w:asciiTheme="majorHAnsi" w:eastAsia="Times New Roman" w:hAnsiTheme="majorHAnsi" w:cstheme="majorHAnsi"/>
-                <w:b/>
-                <w:bCs/>
-                <w:color w:val="000000" w:themeColor="text1"/>
-                <w:sz w:val="22"/>
-                <w:szCs w:val="22"/>
-              </w:rPr>
-            </w:pPr>
-            <w:r>
-              <w:rPr>
-                <w:rFonts w:asciiTheme="majorHAnsi" w:eastAsia="Times New Roman" w:hAnsiTheme="majorHAnsi" w:cstheme="majorHAnsi"/>
-                <w:color w:val="000000" w:themeColor="text1"/>
-                <w:sz w:val="22"/>
-                <w:szCs w:val="22"/>
-              </w:rPr>
-              <w:t xml:space="preserve">Đến 95%</w:t>
-            </w:r>
-          </w:p>
-        </w:tc>
-        <w:tc>
-          <w:tcPr>
-            <w:tcW w:w="4169" w:type="dxa"/>
-            <w:tcBorders>
-              <w:top w:val="nil"/>
-              <w:left w:val="nil"/>
-              <w:bottom w:val="single" w:sz="4" w:space="0" w:color="auto"/>
-              <w:right w:val="single" w:sz="4" w:space="0" w:color="auto"/>
-            </w:tcBorders>
-            <w:vAlign w:val="center"/>
-            <w:hideMark/>
-          </w:tcPr>
-          <w:p>
-            <w:pPr>
-              <w:spacing w:before="0" w:after="0" w:line="240" w:lineRule="auto"/>
-              <w:ind w:left="0"/>
-              <w:jc w:val="left"/>
-              <w:rPr>
-                <w:rFonts w:asciiTheme="majorHAnsi" w:eastAsia="Times New Roman" w:hAnsiTheme="majorHAnsi" w:cstheme="majorHAnsi"/>
-                <w:b/>
-                <w:bCs/>
-                <w:color w:val="000000" w:themeColor="text1"/>
-                <w:sz w:val="22"/>
-                <w:szCs w:val="22"/>
-              </w:rPr>
-            </w:pPr>
-            <w:r>
-              <w:rPr>
-                <w:b/>
-                <w:rFonts w:asciiTheme="majorHAnsi" w:eastAsia="Times New Roman" w:hAnsiTheme="majorHAnsi" w:cstheme="majorHAnsi"/>
-                <w:color w:val="000000" w:themeColor="text1"/>
-                <w:sz w:val="22"/>
-                <w:szCs w:val="22"/>
-              </w:rPr>
-              <w:t xml:space="preserve">Đến 90%</w:t>
-            </w:r>
-            <w:r>
-              <w:rPr>
-                <w:rFonts w:asciiTheme="majorHAnsi" w:eastAsia="Times New Roman" w:hAnsiTheme="majorHAnsi" w:cstheme="majorHAnsi"/>
-                <w:color w:val="000000" w:themeColor="text1"/>
-                <w:sz w:val="22"/>
-                <w:szCs w:val="22"/>
-              </w:rPr>
-              <w:t xml:space="preserve">/tháng, trong 15 ngày làm việc</w:t>
-            </w:r>
-          </w:p>
-        </w:tc>
-      </w:tr>
-      <w:tr>
-        <w:trPr>
-          <w:trHeight w:val="630"/>
-        </w:trPr>
-        <w:tc>
-          <w:tcPr>
-            <w:tcW w:w="700" w:type="dxa"/>
-            <w:tcBorders>
-              <w:top w:val="nil"/>
-              <w:left w:val="nil"/>
-              <w:bottom w:val="single" w:sz="4" w:space="0" w:color="auto"/>
-              <w:right w:val="single" w:sz="4" w:space="0" w:color="auto"/>
-            </w:tcBorders>
-            <w:vAlign w:val="center"/>
-            <w:hideMark/>
-          </w:tcPr>
-          <w:p>
-            <w:pPr>
-              <w:spacing w:before="0" w:after="0" w:line="240" w:lineRule="auto"/>
-              <w:ind w:left="0"/>
-              <w:jc w:val="center"/>
-              <w:rPr>
-                <w:rFonts w:asciiTheme="majorHAnsi" w:eastAsia="Times New Roman" w:hAnsiTheme="majorHAnsi" w:cstheme="majorHAnsi"/>
-                <w:b/>
-                <w:bCs/>
-                <w:color w:val="000000" w:themeColor="text1"/>
-                <w:sz w:val="22"/>
-                <w:szCs w:val="22"/>
-              </w:rPr>
-            </w:pPr>
-            <w:r>
-              <w:rPr>
-                <w:rFonts w:asciiTheme="majorHAnsi" w:eastAsia="Times New Roman" w:hAnsiTheme="majorHAnsi" w:cstheme="majorHAnsi"/>
-                <w:color w:val="000000" w:themeColor="text1"/>
-                <w:sz w:val="22"/>
-                <w:szCs w:val="22"/>
-              </w:rPr>
-              <w:t xml:space="preserve">9</w:t>
-            </w:r>
-          </w:p>
-        </w:tc>
-        <w:tc>
-          <w:tcPr>
-            <w:tcW w:w="2000" w:type="dxa"/>
-            <w:tcBorders>
-              <w:top w:val="nil"/>
-              <w:left w:val="nil"/>
-              <w:bottom w:val="single" w:sz="4" w:space="0" w:color="auto"/>
-              <w:right w:val="single" w:sz="4" w:space="0" w:color="auto"/>
-            </w:tcBorders>
-            <w:vAlign w:val="center"/>
-            <w:hideMark/>
-          </w:tcPr>
-          <w:p>
-            <w:pPr>
-              <w:spacing w:before="0" w:after="0" w:line="240" w:lineRule="auto"/>
-              <w:ind w:left="0"/>
-              <w:jc w:val="left"/>
-              <w:rPr>
-                <w:rFonts w:asciiTheme="majorHAnsi" w:eastAsia="Times New Roman" w:hAnsiTheme="majorHAnsi" w:cstheme="majorHAnsi"/>
-                <w:b/>
-                <w:bCs/>
-                <w:color w:val="000000" w:themeColor="text1"/>
-                <w:sz w:val="22"/>
-                <w:szCs w:val="22"/>
-              </w:rPr>
-            </w:pPr>
-            <w:r>
-              <w:rPr>
-                <w:rFonts w:asciiTheme="majorHAnsi" w:eastAsia="Times New Roman" w:hAnsiTheme="majorHAnsi" w:cstheme="majorHAnsi"/>
-                <w:color w:val="000000" w:themeColor="text1"/>
-                <w:sz w:val="22"/>
-                <w:szCs w:val="22"/>
-              </w:rPr>
-              <w:t xml:space="preserve">Thanh toán 100%</w:t>
-            </w:r>
-          </w:p>
-        </w:tc>
-        <w:tc>
-          <w:tcPr>
-            <w:tcW w:w="3300" w:type="dxa"/>
-            <w:tcBorders>
-              <w:top w:val="nil"/>
-              <w:left w:val="nil"/>
-              <w:bottom w:val="single" w:sz="4" w:space="0" w:color="auto"/>
-              <w:right w:val="single" w:sz="4" w:space="0" w:color="auto"/>
-            </w:tcBorders>
-            <w:vAlign w:val="center"/>
-            <w:hideMark/>
-          </w:tcPr>
-          <w:p>
-            <w:pPr>
-              <w:spacing w:before="0" w:after="0" w:line="240" w:lineRule="auto"/>
-              <w:ind w:left="0"/>
-              <w:jc w:val="left"/>
-              <w:rPr>
-                <w:rFonts w:asciiTheme="majorHAnsi" w:eastAsia="Times New Roman" w:hAnsiTheme="majorHAnsi" w:cstheme="majorHAnsi"/>
-                <w:b/>
-                <w:bCs/>
-                <w:color w:val="000000" w:themeColor="text1"/>
-                <w:sz w:val="22"/>
-                <w:szCs w:val="22"/>
-              </w:rPr>
-            </w:pPr>
-            <w:r>
-              <w:rPr>
-                <w:rFonts w:asciiTheme="majorHAnsi" w:eastAsia="Times New Roman" w:hAnsiTheme="majorHAnsi" w:cstheme="majorHAnsi"/>
-                <w:color w:val="000000" w:themeColor="text1"/>
-                <w:sz w:val="22"/>
-                <w:szCs w:val="22"/>
-              </w:rPr>
-              <w:t xml:space="preserve">Sau 90 ngày</w:t>
-            </w:r>
-          </w:p>
-        </w:tc>
-        <w:tc>
-          <w:tcPr>
-            <w:tcW w:w="4169" w:type="dxa"/>
-            <w:tcBorders>
-              <w:top w:val="nil"/>
-              <w:left w:val="nil"/>
-              <w:bottom w:val="single" w:sz="4" w:space="0" w:color="auto"/>
-              <w:right w:val="single" w:sz="4" w:space="0" w:color="auto"/>
-            </w:tcBorders>
-            <w:vAlign w:val="center"/>
-            <w:hideMark/>
-          </w:tcPr>
-          <w:p>
-            <w:pPr>
-              <w:spacing w:before="0" w:after="0" w:line="240" w:lineRule="auto"/>
-              <w:ind w:left="0"/>
-              <w:jc w:val="left"/>
-              <w:rPr>
-                <w:rFonts w:asciiTheme="majorHAnsi" w:eastAsia="Times New Roman" w:hAnsiTheme="majorHAnsi" w:cstheme="majorHAnsi"/>
-                <w:b/>
-                <w:bCs/>
-                <w:color w:val="000000" w:themeColor="text1"/>
-                <w:sz w:val="22"/>
-                <w:szCs w:val="22"/>
-              </w:rPr>
-            </w:pPr>
-            <w:r>
-              <w:rPr>
-                <w:b/>
-                <w:rFonts w:asciiTheme="majorHAnsi" w:eastAsia="Times New Roman" w:hAnsiTheme="majorHAnsi" w:cstheme="majorHAnsi"/>
-                <w:color w:val="000000" w:themeColor="text1"/>
-                <w:sz w:val="22"/>
-                <w:szCs w:val="22"/>
-              </w:rPr>
-              <w:t xml:space="preserve">Sau 60 ngày</w:t>
-            </w:r>
-            <w:r>
-              <w:rPr>
-                <w:rFonts w:asciiTheme="majorHAnsi" w:eastAsia="Times New Roman" w:hAnsiTheme="majorHAnsi" w:cstheme="majorHAnsi"/>
-                <w:color w:val="000000" w:themeColor="text1"/>
-                <w:sz w:val="22"/>
-                <w:szCs w:val="22"/>
-              </w:rPr>
-              <w:t xml:space="preserve"> kể từ khi hoàn thành</w:t>
-            </w:r>
-          </w:p>
-        </w:tc>
-      </w:tr>
-      <w:tr>
-        <w:trPr>
-          <w:trHeight w:val="630"/>
-        </w:trPr>
-        <w:tc>
-          <w:tcPr>
-            <w:tcW w:w="700" w:type="dxa"/>
-            <w:tcBorders>
-              <w:top w:val="nil"/>
-              <w:left w:val="nil"/>
-              <w:bottom w:val="single" w:sz="4" w:space="0" w:color="auto"/>
-              <w:right w:val="single" w:sz="4" w:space="0" w:color="auto"/>
-            </w:tcBorders>
-            <w:vAlign w:val="center"/>
-            <w:hideMark/>
-          </w:tcPr>
-          <w:p>
-            <w:pPr>
-              <w:spacing w:before="0" w:after="0" w:line="240" w:lineRule="auto"/>
-              <w:ind w:left="0"/>
-              <w:jc w:val="center"/>
-              <w:rPr>
-                <w:rFonts w:asciiTheme="majorHAnsi" w:eastAsia="Times New Roman" w:hAnsiTheme="majorHAnsi" w:cstheme="majorHAnsi"/>
-                <w:b/>
-                <w:bCs/>
-                <w:color w:val="000000" w:themeColor="text1"/>
-                <w:sz w:val="22"/>
-                <w:szCs w:val="22"/>
-              </w:rPr>
-            </w:pPr>
-            <w:r>
-              <w:rPr>
-                <w:rFonts w:asciiTheme="majorHAnsi" w:eastAsia="Times New Roman" w:hAnsiTheme="majorHAnsi" w:cstheme="majorHAnsi"/>
-                <w:color w:val="000000" w:themeColor="text1"/>
-                <w:sz w:val="22"/>
-                <w:szCs w:val="22"/>
-              </w:rPr>
-              <w:t xml:space="preserve">10</w:t>
-            </w:r>
-          </w:p>
-        </w:tc>
-        <w:tc>
-          <w:tcPr>
-            <w:tcW w:w="2000" w:type="dxa"/>
-            <w:tcBorders>
-              <w:top w:val="nil"/>
-              <w:left w:val="nil"/>
-              <w:bottom w:val="single" w:sz="4" w:space="0" w:color="auto"/>
-              <w:right w:val="single" w:sz="4" w:space="0" w:color="auto"/>
-            </w:tcBorders>
-            <w:vAlign w:val="center"/>
-            <w:hideMark/>
-          </w:tcPr>
-          <w:p>
-            <w:pPr>
-              <w:spacing w:before="0" w:after="0" w:line="240" w:lineRule="auto"/>
-              <w:ind w:left="0"/>
-              <w:jc w:val="left"/>
-              <w:rPr>
-                <w:rFonts w:asciiTheme="majorHAnsi" w:eastAsia="Times New Roman" w:hAnsiTheme="majorHAnsi" w:cstheme="majorHAnsi"/>
-                <w:b/>
-                <w:bCs/>
-                <w:color w:val="000000" w:themeColor="text1"/>
-                <w:sz w:val="22"/>
-                <w:szCs w:val="22"/>
-              </w:rPr>
-            </w:pPr>
-            <w:r>
-              <w:rPr>
-                <w:rFonts w:asciiTheme="majorHAnsi" w:eastAsia="Times New Roman" w:hAnsiTheme="majorHAnsi" w:cstheme="majorHAnsi"/>
-                <w:color w:val="000000" w:themeColor="text1"/>
-                <w:sz w:val="22"/>
-                <w:szCs w:val="22"/>
-              </w:rPr>
-              <w:t xml:space="preserve">Khấu trừ rửa xe, bơm nước</w:t>
-            </w:r>
-          </w:p>
-        </w:tc>
-        <w:tc>
-          <w:tcPr>
-            <w:tcW w:w="3300" w:type="dxa"/>
-            <w:tcBorders>
-              <w:top w:val="nil"/>
-              <w:left w:val="nil"/>
-              <w:bottom w:val="single" w:sz="4" w:space="0" w:color="auto"/>
-              <w:right w:val="single" w:sz="4" w:space="0" w:color="auto"/>
-            </w:tcBorders>
-            <w:vAlign w:val="center"/>
-            <w:hideMark/>
-          </w:tcPr>
-          <w:p>
-            <w:pPr>
-              <w:spacing w:before="0" w:after="0" w:line="240" w:lineRule="auto"/>
-              <w:ind w:left="0"/>
-              <w:jc w:val="left"/>
-              <w:rPr>
-                <w:rFonts w:asciiTheme="majorHAnsi" w:eastAsia="Times New Roman" w:hAnsiTheme="majorHAnsi" w:cstheme="majorHAnsi"/>
-                <w:b/>
-                <w:bCs/>
-                <w:color w:val="000000" w:themeColor="text1"/>
-                <w:sz w:val="22"/>
-                <w:szCs w:val="22"/>
-              </w:rPr>
-            </w:pPr>
-            <w:r>
-              <w:rPr>
-                <w:rFonts w:asciiTheme="majorHAnsi" w:eastAsia="Times New Roman" w:hAnsiTheme="majorHAnsi" w:cstheme="majorHAnsi"/>
-                <w:color w:val="000000" w:themeColor="text1"/>
-                <w:sz w:val="22"/>
-                <w:szCs w:val="22"/>
-              </w:rPr>
-              <w:t xml:space="preserve">Tối đa 50 triệu/tháng</w:t>
-            </w:r>
-          </w:p>
-        </w:tc>
-        <w:tc>
-          <w:tcPr>
-            <w:tcW w:w="4169" w:type="dxa"/>
-            <w:tcBorders>
-              <w:top w:val="nil"/>
-              <w:left w:val="nil"/>
-              <w:bottom w:val="single" w:sz="4" w:space="0" w:color="auto"/>
-              <w:right w:val="single" w:sz="4" w:space="0" w:color="auto"/>
-            </w:tcBorders>
-            <w:vAlign w:val="center"/>
-            <w:hideMark/>
-          </w:tcPr>
-          <w:p>
-            <w:pPr>
-              <w:spacing w:before="0" w:after="0" w:line="240" w:lineRule="auto"/>
-              <w:ind w:left="0"/>
-              <w:jc w:val="left"/>
-              <w:rPr>
-                <w:rFonts w:asciiTheme="majorHAnsi" w:eastAsia="Times New Roman" w:hAnsiTheme="majorHAnsi" w:cstheme="majorHAnsi"/>
-                <w:b/>
-                <w:bCs/>
-                <w:color w:val="000000" w:themeColor="text1"/>
-                <w:sz w:val="22"/>
-                <w:szCs w:val="22"/>
-              </w:rPr>
-            </w:pPr>
-            <w:r>
-              <w:rPr>
-                <w:rFonts w:asciiTheme="majorHAnsi" w:eastAsia="Times New Roman" w:hAnsiTheme="majorHAnsi" w:cstheme="majorHAnsi"/>
-                <w:color w:val="000000" w:themeColor="text1"/>
-                <w:sz w:val="22"/>
-                <w:szCs w:val="22"/>
-              </w:rPr>
-              <w:t xml:space="preserve">Tối đa 50 triệu/30 ngày thi công; ngày nghỉ không tính; tối đa 06 tháng</w:t>
-            </w:r>
-          </w:p>
-        </w:tc>
-      </w:tr>
-      <w:tr>
-        <w:trPr>
-          <w:trHeight w:val="630"/>
-        </w:trPr>
-        <w:tc>
-          <w:tcPr>
-            <w:tcW w:w="700" w:type="dxa"/>
-            <w:tcBorders>
-              <w:top w:val="nil"/>
-              <w:left w:val="nil"/>
-              <w:bottom w:val="single" w:sz="4" w:space="0" w:color="auto"/>
-              <w:right w:val="single" w:sz="4" w:space="0" w:color="auto"/>
-            </w:tcBorders>
-            <w:vAlign w:val="center"/>
-            <w:hideMark/>
-          </w:tcPr>
-          <w:p>
-            <w:pPr>
-              <w:spacing w:before="0" w:after="0" w:line="240" w:lineRule="auto"/>
-              <w:ind w:left="0"/>
-              <w:jc w:val="center"/>
-              <w:rPr>
-                <w:rFonts w:asciiTheme="majorHAnsi" w:eastAsia="Times New Roman" w:hAnsiTheme="majorHAnsi" w:cstheme="majorHAnsi"/>
-                <w:b/>
-                <w:bCs/>
-                <w:color w:val="000000" w:themeColor="text1"/>
-                <w:sz w:val="22"/>
-                <w:szCs w:val="22"/>
-              </w:rPr>
-            </w:pPr>
-            <w:r>
-              <w:rPr>
-                <w:rFonts w:asciiTheme="majorHAnsi" w:eastAsia="Times New Roman" w:hAnsiTheme="majorHAnsi" w:cstheme="majorHAnsi"/>
-                <w:color w:val="000000" w:themeColor="text1"/>
-                <w:sz w:val="22"/>
-                <w:szCs w:val="22"/>
-              </w:rPr>
-              <w:t xml:space="preserve">11</w:t>
-            </w:r>
-          </w:p>
-        </w:tc>
-        <w:tc>
-          <w:tcPr>
-            <w:tcW w:w="2000" w:type="dxa"/>
-            <w:tcBorders>
-              <w:top w:val="nil"/>
-              <w:left w:val="nil"/>
-              <w:bottom w:val="single" w:sz="4" w:space="0" w:color="auto"/>
-              <w:right w:val="single" w:sz="4" w:space="0" w:color="auto"/>
-            </w:tcBorders>
-            <w:vAlign w:val="center"/>
-            <w:hideMark/>
-          </w:tcPr>
-          <w:p>
-            <w:pPr>
-              <w:spacing w:before="0" w:after="0" w:line="240" w:lineRule="auto"/>
-              <w:ind w:left="0"/>
-              <w:jc w:val="left"/>
-              <w:rPr>
-                <w:rFonts w:asciiTheme="majorHAnsi" w:eastAsia="Times New Roman" w:hAnsiTheme="majorHAnsi" w:cstheme="majorHAnsi"/>
-                <w:b/>
-                <w:bCs/>
-                <w:color w:val="000000" w:themeColor="text1"/>
-                <w:sz w:val="22"/>
-                <w:szCs w:val="22"/>
-              </w:rPr>
-            </w:pPr>
-            <w:r>
-              <w:rPr>
-                <w:rFonts w:asciiTheme="majorHAnsi" w:eastAsia="Times New Roman" w:hAnsiTheme="majorHAnsi" w:cstheme="majorHAnsi"/>
-                <w:color w:val="000000" w:themeColor="text1"/>
-                <w:sz w:val="22"/>
-                <w:szCs w:val="22"/>
-              </w:rPr>
-              <w:t xml:space="preserve">Hoàng Minh tạm dừng</w:t>
-            </w:r>
-          </w:p>
-        </w:tc>
-        <w:tc>
-          <w:tcPr>
-            <w:tcW w:w="3300" w:type="dxa"/>
-            <w:tcBorders>
-              <w:top w:val="nil"/>
-              <w:left w:val="nil"/>
-              <w:bottom w:val="single" w:sz="4" w:space="0" w:color="auto"/>
-              <w:right w:val="single" w:sz="4" w:space="0" w:color="auto"/>
-            </w:tcBorders>
-            <w:vAlign w:val="center"/>
-            <w:hideMark/>
-          </w:tcPr>
-          <w:p>
-            <w:pPr>
-              <w:spacing w:before="0" w:after="0" w:line="240" w:lineRule="auto"/>
-              <w:ind w:left="0"/>
-              <w:jc w:val="left"/>
-              <w:rPr>
-                <w:rFonts w:asciiTheme="majorHAnsi" w:eastAsia="Times New Roman" w:hAnsiTheme="majorHAnsi" w:cstheme="majorHAnsi"/>
-                <w:b/>
-                <w:bCs/>
-                <w:color w:val="000000" w:themeColor="text1"/>
-                <w:sz w:val="22"/>
-                <w:szCs w:val="22"/>
-              </w:rPr>
-            </w:pPr>
-            <w:r>
-              <w:rPr>
-                <w:rFonts w:asciiTheme="majorHAnsi" w:eastAsia="Times New Roman" w:hAnsiTheme="majorHAnsi" w:cstheme="majorHAnsi"/>
-                <w:color w:val="000000" w:themeColor="text1"/>
-                <w:sz w:val="22"/>
-                <w:szCs w:val="22"/>
-              </w:rPr>
-              <w:t xml:space="preserve">Không có</w:t>
-            </w:r>
-          </w:p>
-        </w:tc>
-        <w:tc>
-          <w:tcPr>
-            <w:tcW w:w="4169" w:type="dxa"/>
-            <w:tcBorders>
-              <w:top w:val="nil"/>
-              <w:left w:val="nil"/>
-              <w:bottom w:val="single" w:sz="4" w:space="0" w:color="auto"/>
-              <w:right w:val="single" w:sz="4" w:space="0" w:color="auto"/>
-            </w:tcBorders>
-            <w:vAlign w:val="center"/>
-            <w:hideMark/>
-          </w:tcPr>
-          <w:p>
-            <w:pPr>
-              <w:spacing w:before="0" w:after="0" w:line="240" w:lineRule="auto"/>
-              <w:ind w:left="0"/>
-              <w:jc w:val="left"/>
-              <w:rPr>
-                <w:rFonts w:asciiTheme="majorHAnsi" w:eastAsia="Times New Roman" w:hAnsiTheme="majorHAnsi" w:cstheme="majorHAnsi"/>
-                <w:b/>
-                <w:bCs/>
-                <w:color w:val="000000" w:themeColor="text1"/>
-                <w:sz w:val="22"/>
-                <w:szCs w:val="22"/>
-              </w:rPr>
-            </w:pPr>
-            <w:r>
-              <w:rPr>
-                <w:rFonts w:asciiTheme="majorHAnsi" w:eastAsia="Times New Roman" w:hAnsiTheme="majorHAnsi" w:cstheme="majorHAnsi"/>
-                <w:color w:val="000000" w:themeColor="text1"/>
-                <w:sz w:val="22"/>
-                <w:szCs w:val="22"/>
-              </w:rPr>
-              <w:t xml:space="preserve">Khi EC chậm thanh toán &gt; 30 ngày, báo trước 03 ngày làm việc</w:t>
-            </w:r>
-          </w:p>
-        </w:tc>
-      </w:tr>
-    </w:tbl>
+    <w:p>
+      <w:pPr>
+        <w:pStyle w:val="ListParagraph"/>
+        <w:numPr>
+          <w:ilvl w:val="0"/>
+          <w:numId w:val="35"/>
+        </w:numPr>
+        <w:spacing w:after="120" w:line="240" w:lineRule="auto"/>
+        <w:ind w:hanging="357"/>
+        <w:contextualSpacing w:val="0"/>
+        <w:rPr>
+          <w:rFonts w:asciiTheme="majorHAnsi" w:hAnsiTheme="majorHAnsi" w:cstheme="majorHAnsi"/>
+          <w:color w:val="000000" w:themeColor="text1"/>
+          <w:lang w:val="en-US"/>
+        </w:rPr>
+      </w:pPr>
+      <w:r>
+        <w:rPr>
+          <w:b/>
+          <w:rFonts w:asciiTheme="majorHAnsi" w:hAnsiTheme="majorHAnsi" w:cstheme="majorHAnsi"/>
+          <w:color w:val="000000" w:themeColor="text1"/>
+          <w:lang w:val="en-US"/>
+        </w:rPr>
+        <w:t xml:space="preserve">Giá trị hợp đồng:</w:t>
+      </w:r>
+      <w:r>
+        <w:rPr>
+          <w:rFonts w:asciiTheme="majorHAnsi" w:hAnsiTheme="majorHAnsi" w:cstheme="majorHAnsi"/>
+          <w:color w:val="000000" w:themeColor="text1"/>
+          <w:lang w:val="en-US"/>
+        </w:rPr>
+        <w:t xml:space="preserve"> </w:t>
+      </w:r>
+      <w:r>
+        <w:rPr>
+          <w:rFonts w:asciiTheme="majorHAnsi" w:hAnsiTheme="majorHAnsi" w:cstheme="majorHAnsi"/>
+          <w:color w:val="000000" w:themeColor="text1"/>
+          <w:highlight w:val="yellow"/>
+          <w:lang w:val="en-US"/>
+        </w:rPr>
+        <w:t xml:space="preserve">……</w:t>
+      </w:r>
+      <w:r>
+        <w:rPr>
+          <w:rFonts w:asciiTheme="majorHAnsi" w:hAnsiTheme="majorHAnsi" w:cstheme="majorHAnsi"/>
+          <w:color w:val="000000" w:themeColor="text1"/>
+          <w:lang w:val="en-US"/>
+        </w:rPr>
+        <w:t xml:space="preserve"> đồng (chưa VAT); đơn giá cố định, thanh toán theo khối lượng thực tế đo cao độ trước và sau thi công.</w:t>
+      </w:r>
+    </w:p>
+    <w:p>
+      <w:pPr>
+        <w:pStyle w:val="ListParagraph"/>
+        <w:numPr>
+          <w:ilvl w:val="0"/>
+          <w:numId w:val="35"/>
+        </w:numPr>
+        <w:spacing w:after="120" w:line="240" w:lineRule="auto"/>
+        <w:ind w:hanging="357"/>
+        <w:contextualSpacing w:val="0"/>
+        <w:rPr>
+          <w:rFonts w:asciiTheme="majorHAnsi" w:hAnsiTheme="majorHAnsi" w:cstheme="majorHAnsi"/>
+          <w:color w:val="000000" w:themeColor="text1"/>
+          <w:lang w:val="en-US"/>
+        </w:rPr>
+      </w:pPr>
+      <w:r>
+        <w:rPr>
+          <w:b/>
+          <w:rFonts w:asciiTheme="majorHAnsi" w:hAnsiTheme="majorHAnsi" w:cstheme="majorHAnsi"/>
+          <w:color w:val="000000" w:themeColor="text1"/>
+          <w:lang w:val="en-US"/>
+        </w:rPr>
+        <w:t xml:space="preserve">Tạm ứng:</w:t>
+      </w:r>
+      <w:r>
+        <w:rPr>
+          <w:rFonts w:asciiTheme="majorHAnsi" w:hAnsiTheme="majorHAnsi" w:cstheme="majorHAnsi"/>
+          <w:color w:val="000000" w:themeColor="text1"/>
+          <w:lang w:val="en-US"/>
+        </w:rPr>
+        <w:t xml:space="preserve"> 500 triệu đồng khi Hoàng Minh huy động đủ 05 thiết bị (03 máy xúc, 02 xe ben) và nộp hợp đồng với bãi đổ Nguyên Khê; thu hồi 20% mỗi lần thanh toán. Không áp dụng bảo lãnh tạm ứng, bảo lãnh thực hiện hợp đồng; thiết bị không được rút khỏi công trường khi chưa hoàn thành công việc.</w:t>
+      </w:r>
+    </w:p>
+    <w:p>
+      <w:pPr>
+        <w:pStyle w:val="ListParagraph"/>
+        <w:numPr>
+          <w:ilvl w:val="0"/>
+          <w:numId w:val="35"/>
+        </w:numPr>
+        <w:spacing w:after="120" w:line="240" w:lineRule="auto"/>
+        <w:ind w:hanging="357"/>
+        <w:contextualSpacing w:val="0"/>
+        <w:rPr>
+          <w:rFonts w:asciiTheme="majorHAnsi" w:hAnsiTheme="majorHAnsi" w:cstheme="majorHAnsi"/>
+          <w:color w:val="000000" w:themeColor="text1"/>
+          <w:lang w:val="en-US"/>
+        </w:rPr>
+      </w:pPr>
+      <w:r>
+        <w:rPr>
+          <w:b/>
+          <w:rFonts w:asciiTheme="majorHAnsi" w:hAnsiTheme="majorHAnsi" w:cstheme="majorHAnsi"/>
+          <w:color w:val="000000" w:themeColor="text1"/>
+          <w:lang w:val="en-US"/>
+        </w:rPr>
+        <w:t xml:space="preserve">Tạm ứng phí đổ thải:</w:t>
+      </w:r>
+      <w:r>
+        <w:rPr>
+          <w:rFonts w:asciiTheme="majorHAnsi" w:hAnsiTheme="majorHAnsi" w:cstheme="majorHAnsi"/>
+          <w:color w:val="000000" w:themeColor="text1"/>
+          <w:lang w:val="en-US"/>
+        </w:rPr>
+        <w:t xml:space="preserve"> khối lượng đổ thải được VNCN E&amp;C, Hoàng Minh và bãi đổ cùng xác nhận × 25.000 đồng/m³; VNCN E&amp;C chuyển thẳng cho bãi đổ theo đề nghị bằng văn bản của Hoàng Minh, khấu trừ toàn bộ vào kỳ thanh toán gần nhất.</w:t>
+      </w:r>
+    </w:p>
+    <w:p>
+      <w:pPr>
+        <w:pStyle w:val="ListParagraph"/>
+        <w:numPr>
+          <w:ilvl w:val="0"/>
+          <w:numId w:val="35"/>
+        </w:numPr>
+        <w:spacing w:after="120" w:line="240" w:lineRule="auto"/>
+        <w:ind w:hanging="357"/>
+        <w:contextualSpacing w:val="0"/>
+        <w:rPr>
+          <w:rFonts w:asciiTheme="majorHAnsi" w:hAnsiTheme="majorHAnsi" w:cstheme="majorHAnsi"/>
+          <w:color w:val="000000" w:themeColor="text1"/>
+          <w:lang w:val="en-US"/>
+        </w:rPr>
+      </w:pPr>
+      <w:r>
+        <w:rPr>
+          <w:b/>
+          <w:rFonts w:asciiTheme="majorHAnsi" w:hAnsiTheme="majorHAnsi" w:cstheme="majorHAnsi"/>
+          <w:color w:val="000000" w:themeColor="text1"/>
+          <w:lang w:val="en-US"/>
+        </w:rPr>
+        <w:t xml:space="preserve">Thanh toán:</w:t>
+      </w:r>
+      <w:r>
+        <w:rPr>
+          <w:rFonts w:asciiTheme="majorHAnsi" w:hAnsiTheme="majorHAnsi" w:cstheme="majorHAnsi"/>
+          <w:color w:val="000000" w:themeColor="text1"/>
+          <w:lang w:val="en-US"/>
+        </w:rPr>
+        <w:t xml:space="preserve"> hằng tháng đến 90% giá trị nghiệm thu, trong 15 ngày làm việc kể từ ngày nhận đủ hồ sơ hợp lệ; thanh toán 100% sau 60 ngày kể từ ngày hoàn thành toàn bộ công việc.</w:t>
+      </w:r>
+    </w:p>
+    <w:p>
+      <w:pPr>
+        <w:pStyle w:val="ListParagraph"/>
+        <w:numPr>
+          <w:ilvl w:val="0"/>
+          <w:numId w:val="35"/>
+        </w:numPr>
+        <w:spacing w:after="120" w:line="240" w:lineRule="auto"/>
+        <w:ind w:hanging="357"/>
+        <w:contextualSpacing w:val="0"/>
+        <w:rPr>
+          <w:rFonts w:asciiTheme="majorHAnsi" w:hAnsiTheme="majorHAnsi" w:cstheme="majorHAnsi"/>
+          <w:color w:val="000000" w:themeColor="text1"/>
+          <w:lang w:val="en-US"/>
+        </w:rPr>
+      </w:pPr>
+      <w:r>
+        <w:rPr>
+          <w:b/>
+          <w:rFonts w:asciiTheme="majorHAnsi" w:hAnsiTheme="majorHAnsi" w:cstheme="majorHAnsi"/>
+          <w:color w:val="000000" w:themeColor="text1"/>
+          <w:lang w:val="en-US"/>
+        </w:rPr>
+        <w:t xml:space="preserve">Rửa xe, bơm thoát nước hố móng:</w:t>
+      </w:r>
+      <w:r>
+        <w:rPr>
+          <w:rFonts w:asciiTheme="majorHAnsi" w:hAnsiTheme="majorHAnsi" w:cstheme="majorHAnsi"/>
+          <w:color w:val="000000" w:themeColor="text1"/>
+          <w:lang w:val="en-US"/>
+        </w:rPr>
+        <w:t xml:space="preserve"> VNCN E&amp;C thực hiện, khấu trừ chi phí thực tế vào thanh toán của Hoàng Minh, tối đa 50 triệu đồng/30 ngày thi công (không tính ngày không thi công), trong tối đa 06 tháng.</w:t>
+      </w:r>
+    </w:p>
+    <w:p>
+      <w:pPr>
+        <w:pStyle w:val="ListParagraph"/>
+        <w:numPr>
+          <w:ilvl w:val="0"/>
+          <w:numId w:val="35"/>
+        </w:numPr>
+        <w:spacing w:after="120" w:line="240" w:lineRule="auto"/>
+        <w:ind w:hanging="357"/>
+        <w:contextualSpacing w:val="0"/>
+        <w:rPr>
+          <w:rFonts w:asciiTheme="majorHAnsi" w:hAnsiTheme="majorHAnsi" w:cstheme="majorHAnsi"/>
+          <w:color w:val="000000" w:themeColor="text1"/>
+          <w:lang w:val="en-US"/>
+        </w:rPr>
+      </w:pPr>
+      <w:r>
+        <w:rPr>
+          <w:b/>
+          <w:rFonts w:asciiTheme="majorHAnsi" w:hAnsiTheme="majorHAnsi" w:cstheme="majorHAnsi"/>
+          <w:color w:val="000000" w:themeColor="text1"/>
+          <w:lang w:val="en-US"/>
+        </w:rPr>
+        <w:t xml:space="preserve">Tạm dừng:</w:t>
+      </w:r>
+      <w:r>
+        <w:rPr>
+          <w:rFonts w:asciiTheme="majorHAnsi" w:hAnsiTheme="majorHAnsi" w:cstheme="majorHAnsi"/>
+          <w:color w:val="000000" w:themeColor="text1"/>
+          <w:lang w:val="en-US"/>
+        </w:rPr>
+        <w:t xml:space="preserve"> Hoàng Minh chỉ được tạm dừng khi VNCN E&amp;C chậm thanh toán quá 30 ngày không có lý do chính đáng và đã thông báo trước 03 ngày làm việc.</w:t>
+      </w:r>
+    </w:p>
     <w:p>
       <w:pPr>
         <w:pStyle w:val="ListParagraph"/>
@@ -2902,7 +1188,7 @@
           <w:color w:val="000000" w:themeColor="text1"/>
           <w:lang w:val="en-US"/>
         </w:rPr>
-        <w:t xml:space="preserve">Các nội dung tại mục 1, 2 thay thế nội dung tương ứng của Tờ trình R5; các nội dung khác giữ nguyên.</w:t>
+        <w:t xml:space="preserve">Phê duyệt kết quả đàm phán và các điều khoản tại mục 1, 2; các nội dung khác thực hiện theo Tờ trình R5 đã duyệt.</w:t>
       </w:r>
     </w:p>
     <w:p>

</xml_diff>